<commit_message>
docs: finalize formatted research paper for release
</commit_message>
<xml_diff>
--- a/paper/chicago_speed_cameras_research.docx
+++ b/paper/chicago_speed_cameras_research.docx
@@ -2,76 +2,756 @@
 <file path=word/document.xml><?xml version="1.0" encoding="utf-8"?>
 <w:document xmlns:w="http://schemas.openxmlformats.org/wordprocessingml/2006/main" xmlns:m="http://schemas.openxmlformats.org/officeDocument/2006/math" xmlns:r="http://schemas.openxmlformats.org/officeDocument/2006/relationships" xmlns:o="urn:schemas-microsoft-com:office:office" xmlns:v="urn:schemas-microsoft-com:vml" xmlns:w10="urn:schemas-microsoft-com:office:word" xmlns:a="http://schemas.openxmlformats.org/drawingml/2006/main" xmlns:pic="http://schemas.openxmlformats.org/drawingml/2006/picture" xmlns:wp="http://schemas.openxmlformats.org/drawingml/2006/wordprocessingDrawing">
   <w:body>
-    <w:sdt>
-      <w:sdtPr>
-        <w:docPartObj>
-          <w:docPartGallery w:val="Table of Contents"/>
-          <w:docPartUnique/>
-        </w:docPartObj>
-      </w:sdtPr>
-      <w:sdtContent>
-        <w:p>
-          <w:pPr>
-            <w:pStyle w:val="TOCHeading"/>
-          </w:pPr>
-          <w:r>
-            <w:t xml:space="preserve">Table of Contents</w:t>
-          </w:r>
-        </w:p>
-        <w:p>
-          <w:r>
-            <w:fldChar w:fldCharType="begin" w:dirty="true"/>
-            <w:instrText xml:space="preserve">TOC \o "1-2" \h \z \u</w:instrText>
-            <w:fldChar w:fldCharType="separate"/>
-            <w:fldChar w:fldCharType="end"/>
-          </w:r>
-        </w:p>
-      </w:sdtContent>
-    </w:sdt>
+    <w:p>
+      <w:pPr>
+        <w:keepNext/>
+        <w:spacing w:before="480"/>
+        <w:jc w:val="left"/>
+      </w:pPr>
+      <w:r>
+        <w:rPr>
+          <w:rFonts w:ascii="Avenir Next" w:hAnsi="Avenir Next"/>
+          <w:b w:val="0"/>
+          <w:caps w:val="0"/>
+          <w:color w:val="5D6772"/>
+          <w:sz w:val="17"/>
+        </w:rPr>
+        <w:t>RESEARCH WORKING PAPER</w:t>
+      </w:r>
+      <w:r>
+        <w:br/>
+      </w:r>
+      <w:r>
+        <w:rPr>
+          <w:rFonts w:ascii="Avenir Next" w:hAnsi="Avenir Next"/>
+          <w:b w:val="0"/>
+          <w:caps w:val="0"/>
+          <w:color w:val="1F3A5F"/>
+          <w:sz w:val="20"/>
+        </w:rPr>
+        <w:t>________________________________________________________________</w:t>
+      </w:r>
+      <w:r>
+        <w:br/>
+      </w:r>
+      <w:r>
+        <w:br/>
+      </w:r>
+      <w:r>
+        <w:br/>
+      </w:r>
+      <w:r>
+        <w:br/>
+      </w:r>
+      <w:r>
+        <w:br/>
+      </w:r>
+      <w:r>
+        <w:rPr>
+          <w:rFonts w:ascii="Georgia" w:hAnsi="Georgia"/>
+          <w:b/>
+          <w:caps w:val="0"/>
+          <w:color w:val="1F3A5F"/>
+          <w:sz w:val="60"/>
+        </w:rPr>
+        <w:t>Do Speed Cameras</w:t>
+      </w:r>
+      <w:r>
+        <w:br/>
+      </w:r>
+      <w:r>
+        <w:rPr>
+          <w:rFonts w:ascii="Georgia" w:hAnsi="Georgia"/>
+          <w:b/>
+          <w:caps w:val="0"/>
+          <w:color w:val="1F3A5F"/>
+          <w:sz w:val="60"/>
+        </w:rPr>
+        <w:t>Make Chicago Safer?</w:t>
+      </w:r>
+      <w:r>
+        <w:br/>
+      </w:r>
+      <w:r>
+        <w:br/>
+      </w:r>
+      <w:r>
+        <w:rPr>
+          <w:rFonts w:ascii="Georgia" w:hAnsi="Georgia"/>
+          <w:b w:val="0"/>
+          <w:caps w:val="0"/>
+          <w:color w:val="2B2F33"/>
+          <w:sz w:val="30"/>
+        </w:rPr>
+        <w:t>A Geospatial Causal Inference and Machine Learning Study</w:t>
+      </w:r>
+      <w:r>
+        <w:br/>
+      </w:r>
+      <w:r>
+        <w:br/>
+      </w:r>
+      <w:r>
+        <w:br/>
+      </w:r>
+      <w:r>
+        <w:br/>
+      </w:r>
+      <w:r>
+        <w:rPr>
+          <w:rFonts w:ascii="Georgia" w:hAnsi="Georgia"/>
+          <w:b/>
+          <w:caps w:val="0"/>
+          <w:color w:val="2B2F33"/>
+          <w:sz w:val="25"/>
+        </w:rPr>
+        <w:t>Saketh Donepudi</w:t>
+      </w:r>
+      <w:r>
+        <w:br/>
+      </w:r>
+      <w:r>
+        <w:rPr>
+          <w:rFonts w:ascii="Georgia" w:hAnsi="Georgia"/>
+          <w:b/>
+          <w:caps w:val="0"/>
+          <w:color w:val="2B2F33"/>
+          <w:sz w:val="25"/>
+        </w:rPr>
+        <w:t>Amrutha Kakumani</w:t>
+      </w:r>
+      <w:r>
+        <w:br/>
+      </w:r>
+      <w:r>
+        <w:br/>
+      </w:r>
+      <w:r>
+        <w:br/>
+      </w:r>
+      <w:r>
+        <w:rPr>
+          <w:rFonts w:ascii="Avenir Next" w:hAnsi="Avenir Next"/>
+          <w:b w:val="0"/>
+          <w:caps w:val="0"/>
+          <w:color w:val="5D6772"/>
+          <w:sz w:val="17"/>
+        </w:rPr>
+        <w:t>October 2026  ·  Chicago, Illinois — Study Location</w:t>
+      </w:r>
+      <w:r>
+        <w:br/>
+      </w:r>
+      <w:r>
+        <w:rPr>
+          <w:rFonts w:ascii="Avenir Next" w:hAnsi="Avenir Next"/>
+          <w:b w:val="0"/>
+          <w:caps w:val="0"/>
+          <w:color w:val="5D6772"/>
+          <w:sz w:val="17"/>
+        </w:rPr>
+        <w:t>Independent research working paper · Not peer reviewed</w:t>
+      </w:r>
+      <w:r>
+        <w:br/>
+      </w:r>
+      <w:r>
+        <w:drawing>
+          <wp:inline>
+            <wp:extent cx="2926080" cy="2437146"/>
+            <wp:docPr id="72" name="Picture 72"/>
+            <wp:cNvGraphicFramePr>
+              <a:graphicFrameLocks noChangeAspect="1"/>
+            </wp:cNvGraphicFramePr>
+            <a:graphic>
+              <a:graphicData uri="http://schemas.openxmlformats.org/drawingml/2006/picture">
+                <pic:pic>
+                  <pic:nvPicPr>
+                    <pic:cNvPr id="0" name="cover_street_grid.png"/>
+                    <pic:cNvPicPr/>
+                  </pic:nvPicPr>
+                  <pic:blipFill>
+                    <a:blip r:embed="rId9"/>
+                    <a:stretch>
+                      <a:fillRect/>
+                    </a:stretch>
+                  </pic:blipFill>
+                  <pic:spPr>
+                    <a:xfrm>
+                      <a:off x="0" y="0"/>
+                      <a:ext cx="2926080" cy="2437146"/>
+                    </a:xfrm>
+                    <a:prstGeom prst="rect"/>
+                  </pic:spPr>
+                </pic:pic>
+              </a:graphicData>
+            </a:graphic>
+          </wp:inline>
+        </w:drawing>
+      </w:r>
+    </w:p>
+    <w:p>
+      <w:pPr>
+        <w:pageBreakBefore/>
+        <w:spacing w:before="400"/>
+      </w:pPr>
+      <w:r>
+        <w:rPr>
+          <w:rFonts w:ascii="Avenir Next" w:hAnsi="Avenir Next"/>
+          <w:b w:val="0"/>
+          <w:caps w:val="0"/>
+          <w:color w:val="5D6772"/>
+          <w:sz w:val="17"/>
+        </w:rPr>
+        <w:t>AUTHORS &amp; PUBLICATION INFORMATION</w:t>
+      </w:r>
+      <w:r>
+        <w:br/>
+      </w:r>
+      <w:r>
+        <w:rPr>
+          <w:rFonts w:ascii="Avenir Next" w:hAnsi="Avenir Next"/>
+          <w:b w:val="0"/>
+          <w:caps w:val="0"/>
+          <w:color w:val="1F3A5F"/>
+          <w:sz w:val="18"/>
+        </w:rPr>
+        <w:t>______________________________</w:t>
+      </w:r>
+      <w:r>
+        <w:br/>
+      </w:r>
+      <w:r>
+        <w:br/>
+      </w:r>
+      <w:r>
+        <w:br/>
+      </w:r>
+      <w:r>
+        <w:br/>
+      </w:r>
+      <w:r>
+        <w:rPr>
+          <w:rFonts w:ascii="Georgia" w:hAnsi="Georgia"/>
+          <w:b/>
+          <w:caps w:val="0"/>
+          <w:color w:val="1F3A5F"/>
+          <w:sz w:val="36"/>
+        </w:rPr>
+        <w:t>Saketh Donepudi</w:t>
+      </w:r>
+      <w:r>
+        <w:br/>
+      </w:r>
+      <w:r>
+        <w:rPr>
+          <w:rFonts w:ascii="Avenir Next" w:hAnsi="Avenir Next"/>
+          <w:b w:val="0"/>
+          <w:caps w:val="0"/>
+          <w:color w:val="5D6772"/>
+          <w:sz w:val="20"/>
+        </w:rPr>
+        <w:t>Co-author</w:t>
+      </w:r>
+      <w:r>
+        <w:br/>
+      </w:r>
+      <w:r>
+        <w:br/>
+      </w:r>
+      <w:r>
+        <w:rPr>
+          <w:rFonts w:ascii="Georgia" w:hAnsi="Georgia"/>
+          <w:b/>
+          <w:caps w:val="0"/>
+          <w:color w:val="1F3A5F"/>
+          <w:sz w:val="36"/>
+        </w:rPr>
+        <w:t>Amrutha Kakumani</w:t>
+      </w:r>
+      <w:r>
+        <w:br/>
+      </w:r>
+      <w:r>
+        <w:rPr>
+          <w:rFonts w:ascii="Avenir Next" w:hAnsi="Avenir Next"/>
+          <w:b w:val="0"/>
+          <w:caps w:val="0"/>
+          <w:color w:val="5D6772"/>
+          <w:sz w:val="20"/>
+        </w:rPr>
+        <w:t>Co-author</w:t>
+      </w:r>
+      <w:r>
+        <w:br/>
+      </w:r>
+      <w:r>
+        <w:br/>
+      </w:r>
+      <w:r>
+        <w:br/>
+      </w:r>
+      <w:r>
+        <w:br/>
+      </w:r>
+      <w:r>
+        <w:rPr>
+          <w:rFonts w:ascii="Avenir Next" w:hAnsi="Avenir Next"/>
+          <w:b w:val="0"/>
+          <w:caps w:val="0"/>
+          <w:color w:val="5D6772"/>
+          <w:sz w:val="18"/>
+        </w:rPr>
+        <w:t>Affiliations, verified individual contributions, and correspondence details are withheld pending written approval from both co-authors. No university affiliation or contribution is asserted.</w:t>
+      </w:r>
+      <w:r>
+        <w:br/>
+      </w:r>
+      <w:r>
+        <w:br/>
+      </w:r>
+      <w:r>
+        <w:rPr>
+          <w:rFonts w:ascii="Georgia" w:hAnsi="Georgia"/>
+          <w:b w:val="0"/>
+          <w:caps w:val="0"/>
+          <w:color w:val="2B2F33"/>
+          <w:sz w:val="19"/>
+        </w:rPr>
+        <w:t>“This manuscript is an independent research working paper and has not undergone formal peer review.”</w:t>
+      </w:r>
+      <w:r>
+        <w:br/>
+      </w:r>
+      <w:r>
+        <w:br/>
+      </w:r>
+      <w:r>
+        <w:rPr>
+          <w:rFonts w:ascii="Avenir Next" w:hAnsi="Avenir Next"/>
+          <w:b w:val="0"/>
+          <w:caps w:val="0"/>
+          <w:color w:val="5D6772"/>
+          <w:sz w:val="17"/>
+        </w:rPr>
+        <w:t>Repository</w:t>
+      </w:r>
+      <w:r>
+        <w:br/>
+      </w:r>
+      <w:r>
+        <w:rPr>
+          <w:rFonts w:ascii="Avenir Next" w:hAnsi="Avenir Next"/>
+          <w:b w:val="0"/>
+          <w:caps w:val="0"/>
+          <w:color w:val="5D6772"/>
+          <w:sz w:val="17"/>
+        </w:rPr>
+        <w:t>https://github.com/amruthakakumani/Do-Chicago-speed-cameras-reduce-crashes-</w:t>
+      </w:r>
+    </w:p>
     <w:p>
       <w:pPr>
         <w:pStyle w:val="Heading1"/>
-      </w:pPr>
-      <w:bookmarkStart w:id="9" w:name="_786a3727571eebc4050051c8fb0a8e0e1a8da1b"/>
-      <w:r>
-        <w:t xml:space="preserve">Do Speed Cameras Make Chicago Safer? A Geospatial Causal Inference and Machine Learning Study</w:t>
+        <w:pageBreakBefore/>
+        <w:spacing w:before="240" w:after="160"/>
+      </w:pPr>
+      <w:r>
+        <w:t>Contents</w:t>
+      </w:r>
+    </w:p>
+    <w:p>
+      <w:pPr>
+        <w:tabs>
+          <w:tab w:pos="8928" w:val="right" w:leader="dot"/>
+        </w:tabs>
+      </w:pPr>
+      <w:r>
+        <w:fldChar w:fldCharType="begin" w:dirty="true"/>
+        <w:instrText xml:space="preserve">TOC \o "1-2" \h \z \u</w:instrText>
+        <w:fldChar w:fldCharType="separate"/>
+      </w:r>
+      <w:r>
+        <w:rPr>
+          <w:rFonts w:ascii="Georgia" w:hAnsi="Georgia"/>
+          <w:sz w:val="18"/>
+        </w:rPr>
+        <w:t>Abstract</w:t>
+      </w:r>
+      <w:r>
+        <w:tab/>
+      </w:r>
+      <w:r>
+        <w:rPr>
+          <w:rFonts w:ascii="Georgia" w:hAnsi="Georgia"/>
+          <w:sz w:val="18"/>
+        </w:rPr>
+        <w:t>1</w:t>
+      </w:r>
+      <w:r>
+        <w:br/>
+      </w:r>
+      <w:r>
+        <w:rPr>
+          <w:rFonts w:ascii="Georgia" w:hAnsi="Georgia"/>
+          <w:sz w:val="18"/>
+        </w:rPr>
+        <w:t>1. Introduction</w:t>
+      </w:r>
+      <w:r>
+        <w:tab/>
+      </w:r>
+      <w:r>
+        <w:rPr>
+          <w:rFonts w:ascii="Georgia" w:hAnsi="Georgia"/>
+          <w:sz w:val="18"/>
+        </w:rPr>
+        <w:t>1</w:t>
+      </w:r>
+      <w:r>
+        <w:br/>
+      </w:r>
+      <w:r>
+        <w:rPr>
+          <w:rFonts w:ascii="Georgia" w:hAnsi="Georgia"/>
+          <w:sz w:val="18"/>
+        </w:rPr>
+        <w:t>2. Related work</w:t>
+      </w:r>
+      <w:r>
+        <w:tab/>
+      </w:r>
+      <w:r>
+        <w:rPr>
+          <w:rFonts w:ascii="Georgia" w:hAnsi="Georgia"/>
+          <w:sz w:val="18"/>
+        </w:rPr>
+        <w:t>1</w:t>
+      </w:r>
+      <w:r>
+        <w:br/>
+      </w:r>
+      <w:r>
+        <w:rPr>
+          <w:rFonts w:ascii="Georgia" w:hAnsi="Georgia"/>
+          <w:sz w:val="18"/>
+        </w:rPr>
+        <w:t>3. Data and study setting</w:t>
+      </w:r>
+      <w:r>
+        <w:tab/>
+      </w:r>
+      <w:r>
+        <w:rPr>
+          <w:rFonts w:ascii="Georgia" w:hAnsi="Georgia"/>
+          <w:sz w:val="18"/>
+        </w:rPr>
+        <w:t>2</w:t>
+      </w:r>
+      <w:r>
+        <w:br/>
+      </w:r>
+      <w:r>
+        <w:rPr>
+          <w:rFonts w:ascii="Georgia" w:hAnsi="Georgia"/>
+          <w:sz w:val="18"/>
+        </w:rPr>
+        <w:t>4. Causal identification strategy</w:t>
+      </w:r>
+      <w:r>
+        <w:tab/>
+      </w:r>
+      <w:r>
+        <w:rPr>
+          <w:rFonts w:ascii="Georgia" w:hAnsi="Georgia"/>
+          <w:sz w:val="18"/>
+        </w:rPr>
+        <w:t>3</w:t>
+      </w:r>
+      <w:r>
+        <w:br/>
+      </w:r>
+      <w:r>
+        <w:rPr>
+          <w:rFonts w:ascii="Georgia" w:hAnsi="Georgia"/>
+          <w:sz w:val="18"/>
+        </w:rPr>
+        <w:t>5. Geospatial matching and treatment definition</w:t>
+      </w:r>
+      <w:r>
+        <w:tab/>
+      </w:r>
+      <w:r>
+        <w:rPr>
+          <w:rFonts w:ascii="Georgia" w:hAnsi="Georgia"/>
+          <w:sz w:val="18"/>
+        </w:rPr>
+        <w:t>4</w:t>
+      </w:r>
+      <w:r>
+        <w:br/>
+      </w:r>
+      <w:r>
+        <w:rPr>
+          <w:rFonts w:ascii="Georgia" w:hAnsi="Georgia"/>
+          <w:sz w:val="18"/>
+        </w:rPr>
+        <w:t>6. Statistical models</w:t>
+      </w:r>
+      <w:r>
+        <w:tab/>
+      </w:r>
+      <w:r>
+        <w:rPr>
+          <w:rFonts w:ascii="Georgia" w:hAnsi="Georgia"/>
+          <w:sz w:val="18"/>
+        </w:rPr>
+        <w:t>6</w:t>
+      </w:r>
+      <w:r>
+        <w:br/>
+      </w:r>
+      <w:r>
+        <w:rPr>
+          <w:rFonts w:ascii="Georgia" w:hAnsi="Georgia"/>
+          <w:sz w:val="18"/>
+        </w:rPr>
+        <w:t>7. Causal results</w:t>
+      </w:r>
+      <w:r>
+        <w:tab/>
+      </w:r>
+      <w:r>
+        <w:rPr>
+          <w:rFonts w:ascii="Georgia" w:hAnsi="Georgia"/>
+          <w:sz w:val="18"/>
+        </w:rPr>
+        <w:t>7</w:t>
+      </w:r>
+      <w:r>
+        <w:br/>
+      </w:r>
+      <w:r>
+        <w:rPr>
+          <w:rFonts w:ascii="Georgia" w:hAnsi="Georgia"/>
+          <w:sz w:val="18"/>
+        </w:rPr>
+        <w:t>8. Robustness and sensitivity analysis</w:t>
+      </w:r>
+      <w:r>
+        <w:tab/>
+      </w:r>
+      <w:r>
+        <w:rPr>
+          <w:rFonts w:ascii="Georgia" w:hAnsi="Georgia"/>
+          <w:sz w:val="18"/>
+        </w:rPr>
+        <w:t>9</w:t>
+      </w:r>
+      <w:r>
+        <w:br/>
+      </w:r>
+      <w:r>
+        <w:rPr>
+          <w:rFonts w:ascii="Georgia" w:hAnsi="Georgia"/>
+          <w:sz w:val="18"/>
+        </w:rPr>
+        <w:t>9. Crash forecasting using LightGBM</w:t>
+      </w:r>
+      <w:r>
+        <w:tab/>
+      </w:r>
+      <w:r>
+        <w:rPr>
+          <w:rFonts w:ascii="Georgia" w:hAnsi="Georgia"/>
+          <w:sz w:val="18"/>
+        </w:rPr>
+        <w:t>10</w:t>
+      </w:r>
+      <w:r>
+        <w:br/>
+      </w:r>
+      <w:r>
+        <w:rPr>
+          <w:rFonts w:ascii="Georgia" w:hAnsi="Georgia"/>
+          <w:sz w:val="18"/>
+        </w:rPr>
+        <w:t>10. Prediction evaluation and uncertainty</w:t>
+      </w:r>
+      <w:r>
+        <w:tab/>
+      </w:r>
+      <w:r>
+        <w:rPr>
+          <w:rFonts w:ascii="Georgia" w:hAnsi="Georgia"/>
+          <w:sz w:val="18"/>
+        </w:rPr>
+        <w:t>11</w:t>
+      </w:r>
+      <w:r>
+        <w:br/>
+      </w:r>
+      <w:r>
+        <w:rPr>
+          <w:rFonts w:ascii="Georgia" w:hAnsi="Georgia"/>
+          <w:sz w:val="18"/>
+        </w:rPr>
+        <w:t>11. Discussion</w:t>
+      </w:r>
+      <w:r>
+        <w:tab/>
+      </w:r>
+      <w:r>
+        <w:rPr>
+          <w:rFonts w:ascii="Georgia" w:hAnsi="Georgia"/>
+          <w:sz w:val="18"/>
+        </w:rPr>
+        <w:t>15</w:t>
+      </w:r>
+      <w:r>
+        <w:br/>
+      </w:r>
+      <w:r>
+        <w:rPr>
+          <w:rFonts w:ascii="Georgia" w:hAnsi="Georgia"/>
+          <w:sz w:val="18"/>
+        </w:rPr>
+        <w:t>12. Limitations</w:t>
+      </w:r>
+      <w:r>
+        <w:tab/>
+      </w:r>
+      <w:r>
+        <w:rPr>
+          <w:rFonts w:ascii="Georgia" w:hAnsi="Georgia"/>
+          <w:sz w:val="18"/>
+        </w:rPr>
+        <w:t>16</w:t>
+      </w:r>
+      <w:r>
+        <w:br/>
+      </w:r>
+      <w:r>
+        <w:rPr>
+          <w:rFonts w:ascii="Georgia" w:hAnsi="Georgia"/>
+          <w:sz w:val="18"/>
+        </w:rPr>
+        <w:t>13. Conclusion</w:t>
+      </w:r>
+      <w:r>
+        <w:tab/>
+      </w:r>
+      <w:r>
+        <w:rPr>
+          <w:rFonts w:ascii="Georgia" w:hAnsi="Georgia"/>
+          <w:sz w:val="18"/>
+        </w:rPr>
+        <w:t>16</w:t>
+      </w:r>
+      <w:r>
+        <w:br/>
+      </w:r>
+      <w:r>
+        <w:rPr>
+          <w:rFonts w:ascii="Georgia" w:hAnsi="Georgia"/>
+          <w:sz w:val="18"/>
+        </w:rPr>
+        <w:t>References</w:t>
+      </w:r>
+      <w:r>
+        <w:tab/>
+      </w:r>
+      <w:r>
+        <w:rPr>
+          <w:rFonts w:ascii="Georgia" w:hAnsi="Georgia"/>
+          <w:sz w:val="18"/>
+        </w:rPr>
+        <w:t>17</w:t>
+      </w:r>
+      <w:r>
+        <w:br/>
+      </w:r>
+      <w:r>
+        <w:rPr>
+          <w:rFonts w:ascii="Georgia" w:hAnsi="Georgia"/>
+          <w:sz w:val="18"/>
+        </w:rPr>
+        <w:t>Appendix A — Reproducibility</w:t>
+      </w:r>
+      <w:r>
+        <w:tab/>
+      </w:r>
+      <w:r>
+        <w:rPr>
+          <w:rFonts w:ascii="Georgia" w:hAnsi="Georgia"/>
+          <w:sz w:val="18"/>
+        </w:rPr>
+        <w:t>18</w:t>
+      </w:r>
+      <w:r>
+        <w:fldChar w:fldCharType="end"/>
+      </w:r>
+    </w:p>
+    <w:p>
+      <w:pPr>
+        <w:sectPr>
+          <w:type w:val="nextPage"/>
+          <w:headerReference w:type="default" r:id="rId10"/>
+          <w:footerReference w:type="default" r:id="rId11"/>
+          <w:footnotePr>
+            <w:numRestart w:val="eachSect"/>
+          </w:footnotePr>
+          <w:pgSz w:w="12240" w:h="15840"/>
+          <w:pgMar w:top="1325" w:bottom="1325" w:left="1469" w:right="1469"/>
+        </w:sectPr>
+      </w:pPr>
+    </w:p>
+    <w:p>
+      <w:pPr>
+        <w:pStyle w:val="Heading2"/>
+      </w:pPr>
+      <w:bookmarkStart w:id="9" w:name="_abstract"/>
+      <w:r>
+        <w:t xml:space="preserve">Abstract</w:t>
       </w:r>
       <w:bookmarkEnd w:id="9"/>
     </w:p>
     <w:p>
       <w:pPr>
         <w:pStyle w:val="FirstParagraph"/>
+      </w:pPr>
+      <w:r>
+        <w:t xml:space="preserve">Speed cameras are installed where crashes are already high, so naive before/after comparisons confound enforcement with mean reversion, local trends and city-wide shocks. This paper reports a reproducible study of Chicago’s automated speed enforcement program using public crash records from 2015-09 to 2026-08. Citywide reporting begins only in September 2017. The causal design compares 250 m camera catchments with nearby matched sites, removes overlapping camera catchments, and uses conditional Poisson fixed effects and a cohort 2×2 estimator. The original notebook’s −7.3% estimate (95% CI −13.6% to −0.6%) reproduces exactly, but it depends on citywide matching that the documentation did not describe and retains overlapping cameras. Under local 2,000 m matching with overlap removal, the estimate is −2.6% (−11.5% to +7.2%; p = 0.59) across 20 cameras. A coverage-consistent design that requires 24 citywide pre-months and 36 post-months leaves 15 cameras and gives −8.6% (−16.9% to +0.4%; p = 0.061), with a geographic placebo p-value of 0.25; this is a different sample, not a direct replication. A separate LightGBM system forecasts monthly crashes at 1,355 crash-dense locations. V1 achieves held-out MAE 1.568, RMSE 2.093 and Poisson deviance 1.223; an 84-feature V2 improves retrospective deviance by 0.4% and fails a pre-declared 1% promotion rule. A coverage-tuned model improves deviance by 0.65% on 15,912 common test rows—also below the rule—so V1 remains deployed. Approximate 90% conformal intervals cover 90.6% of V1 test rows but only 84.8% of the highest-risk decile. Traffic AADT is excluded because the public series begins in 2022-07 and covers only 2,525 segments. The central lesson is that the answer to</w:t>
+      </w:r>
+      <w:r>
+        <w:t xml:space="preserve"> </w:t>
+      </w:r>
+      <w:r>
+        <w:t xml:space="preserve">“do cameras work?”</w:t>
+      </w:r>
+      <w:r>
+        <w:t xml:space="preserve"> </w:t>
+      </w:r>
+      <w:r>
+        <w:t xml:space="preserve">is highly sensitive to spatial and reporting design, and that forecasting accuracy is not causal identification.</w:t>
+      </w:r>
+    </w:p>
+    <w:p>
+      <w:pPr>
+        <w:pStyle w:val="BodyText"/>
       </w:pPr>
       <w:r>
         <w:rPr>
           <w:b/>
           <w:bCs/>
         </w:rPr>
-        <w:t xml:space="preserve">Saketh Donepudi and Amrutha Kakumani</w:t>
-      </w:r>
-    </w:p>
-    <w:p>
-      <w:pPr>
-        <w:pStyle w:val="BodyText"/>
-      </w:pPr>
-      <w:r>
-        <w:rPr>
-          <w:i/>
-          <w:iCs/>
-        </w:rPr>
-        <w:t xml:space="preserve">Working paper · October 2026 · Not peer reviewed</w:t>
-      </w:r>
-    </w:p>
-    <w:p>
-      <w:pPr>
-        <w:pStyle w:val="BodyText"/>
-      </w:pPr>
-      <w:r>
-        <w:rPr>
-          <w:i/>
-          <w:iCs/>
-        </w:rPr>
-        <w:t xml:space="preserve">Affiliations and individual contribution roles are pending confirmation by both co-authors. No institutional endorsement is claimed.</w:t>
+        <w:t xml:space="preserve">Keywords:</w:t>
+      </w:r>
+      <w:r>
+        <w:t xml:space="preserve"> </w:t>
+      </w:r>
+      <w:r>
+        <w:t xml:space="preserve">automated speed enforcement; difference-in-differences; staggered adoption; synthetic control; conformal prediction; LightGBM; road safety; reproducibility.</w:t>
       </w:r>
     </w:p>
     <w:p>
@@ -85,9 +765,9 @@
       <w:pPr>
         <w:pStyle w:val="Heading2"/>
       </w:pPr>
-      <w:bookmarkStart w:id="10" w:name="_abstract"/>
-      <w:r>
-        <w:t xml:space="preserve">Abstract</w:t>
+      <w:bookmarkStart w:id="10" w:name="_introduction"/>
+      <w:r>
+        <w:t xml:space="preserve">1. Introduction</w:t>
       </w:r>
       <w:bookmarkEnd w:id="10"/>
     </w:p>
@@ -96,19 +776,7 @@
         <w:pStyle w:val="FirstParagraph"/>
       </w:pPr>
       <w:r>
-        <w:t xml:space="preserve">Speed cameras are installed where crashes are already high, so naive before/after comparisons confound enforcement with mean reversion, local trends and city-wide shocks. This paper reports a reproducible study of Chicago’s automated speed enforcement program using public crash records from 2015-09 to 2026-08. Citywide reporting begins only in September 2017. The causal design compares 250 m camera catchments with nearby matched sites, removes overlapping camera catchments, and uses conditional Poisson fixed effects and a cohort 2×2 estimator. The original notebook’s −7.3% estimate (95% CI −13.6% to −0.6%) reproduces exactly, but it depends on citywide matching that the documentation did not describe and retains overlapping cameras. Under local 2,000 m matching with overlap removal, the estimate is −2.6% (−11.5% to +7.2%; p = 0.59) across 20 cameras. A coverage-consistent design that requires 24 citywide pre-months and 36 post-months leaves 15 cameras and gives −8.6% (−16.9% to +0.4%; p = 0.061), with a geographic placebo p-value of 0.25; this is a different sample, not a direct replication. A separate LightGBM system forecasts monthly crashes at 1,355 crash-dense locations. V1 achieves held-out MAE 1.568, RMSE 2.093 and Poisson deviance 1.223; an 84-feature V2 improves retrospective deviance by 0.4% and fails a pre-declared 1% promotion rule. A coverage-tuned model improves deviance by 0.65% on 15,912 common test rows—also below the rule—so V1 remains deployed. Approximate 90% conformal intervals cover 90.6% of V1 test rows but only 84.8% of the highest-risk decile. Traffic AADT is excluded because the public series begins in 2022-07 and covers only 2,525 segments. The central lesson is that the answer to</w:t>
-      </w:r>
-      <w:r>
-        <w:t xml:space="preserve"> </w:t>
-      </w:r>
-      <w:r>
-        <w:t xml:space="preserve">“do cameras work?”</w:t>
-      </w:r>
-      <w:r>
-        <w:t xml:space="preserve"> </w:t>
-      </w:r>
-      <w:r>
-        <w:t xml:space="preserve">is highly sensitive to spatial and reporting design, and that forecasting accuracy is not causal identification.</w:t>
+        <w:t xml:space="preserve">Chicago began automated speed enforcement in school and park safety zones in 2013 and expanded the program substantially in later years. The policy question is simple to state and difficult to answer: do cameras reduce crashes? A simple comparison of crash counts before and after activation is not informative, because cameras are deliberately placed at locations with high crash histories. Crashes at those locations tend to fall even without a camera—regression to the mean—and city-wide changes such as the COVID-19 pandemic move every location at once.</w:t>
       </w:r>
     </w:p>
     <w:p>
@@ -116,17 +784,23 @@
         <w:pStyle w:val="BodyText"/>
       </w:pPr>
       <w:r>
-        <w:rPr>
-          <w:b/>
-          <w:bCs/>
-        </w:rPr>
-        <w:t xml:space="preserve">Keywords:</w:t>
-      </w:r>
-      <w:r>
-        <w:t xml:space="preserve"> </w:t>
-      </w:r>
-      <w:r>
-        <w:t xml:space="preserve">automated speed enforcement; difference-in-differences; staggered adoption; synthetic control; conformal prediction; LightGBM; road safety; reproducibility.</w:t>
+        <w:t xml:space="preserve">This paper asks two related questions. First, can the observed association between cameras and crashes be interpreted causally, and how sensitive is the estimated effect to geographic matching, treatment timing and research design? Second, how accurately can a single LightGBM model forecast location-level crash counts, and where does it fail? The two analyses are deliberately separate. A prediction model estimates expected crashes under observed patterns; it does not estimate the counterfactual effect of installing or removing a camera.</w:t>
+      </w:r>
+    </w:p>
+    <w:p>
+      <w:pPr>
+        <w:pStyle w:val="BodyText"/>
+      </w:pPr>
+      <w:r>
+        <w:t xml:space="preserve">The study makes three modest contributions: a reproducible audit that exactly reproduces the −7.3% estimate and shows it is not robust to defensible design changes; conditional Poisson and cohort 2×2 estimators that avoid negative weighting under staggered adoption; and a geographically validated forecasting layer with conformal uncertainty that is explicitly not causal evidence.</w:t>
+      </w:r>
+    </w:p>
+    <w:p>
+      <w:pPr>
+        <w:pStyle w:val="BodyText"/>
+      </w:pPr>
+      <w:r>
+        <w:t xml:space="preserve">The headline result is not a new national estimate of camera effectiveness. It is a statement about design sensitivity: the same public data, with plausible changes to matching and overlap handling, move the estimate from a statistically significant −7% to a wide interval that includes zero. That is the most defensible finding the data support.</w:t>
       </w:r>
     </w:p>
     <w:p>
@@ -140,9 +814,9 @@
       <w:pPr>
         <w:pStyle w:val="Heading2"/>
       </w:pPr>
-      <w:bookmarkStart w:id="11" w:name="_introduction"/>
-      <w:r>
-        <w:t xml:space="preserve">1. Introduction</w:t>
+      <w:bookmarkStart w:id="11" w:name="_c402fc6a47ec8bb5e751ab4b29e0fc7601a51bb"/>
+      <w:r>
+        <w:t xml:space="preserve">2. Related work</w:t>
       </w:r>
       <w:bookmarkEnd w:id="11"/>
     </w:p>
@@ -151,7 +825,7 @@
         <w:pStyle w:val="FirstParagraph"/>
       </w:pPr>
       <w:r>
-        <w:t xml:space="preserve">Chicago began automated speed enforcement in school and park safety zones in 2013 and expanded the program substantially in later years. The policy question is simple to state and difficult to answer: do cameras reduce crashes? A simple comparison of crash counts before and after activation is not informative, because cameras are deliberately placed at locations with high crash histories. Crashes at those locations tend to fall even without a camera—regression to the mean—and city-wide changes such as the COVID-19 pandemic move every location at once.</w:t>
+        <w:t xml:space="preserve">The road-safety literature generally finds reductions in collisions and casualties near speed cameras, with weaker evidence on wider-area effects and severity. Pilkington and Kinra (2005) emphasize study quality and regression to the mean; Wilson et al. (2010) find the strongest evidence for fatal and serious injuries; Graham et al. (2019) study London and note displacement and heterogeneity.</w:t>
       </w:r>
     </w:p>
     <w:p>
@@ -159,7 +833,7 @@
         <w:pStyle w:val="BodyText"/>
       </w:pPr>
       <w:r>
-        <w:t xml:space="preserve">This paper asks two related questions. First, can the observed association between cameras and crashes be interpreted causally, and how sensitive is the estimated effect to geographic matching, treatment timing and research design? Second, how accurately can a single LightGBM model forecast location-level crash counts, and where does it fail? The two analyses are deliberately separate. A prediction model estimates expected crashes under observed patterns; it does not estimate the counterfactual effect of installing or removing a camera.</w:t>
+        <w:t xml:space="preserve">Chicago-specific evidence is most relevant. Tilahun (2023) uses an empirical Bayes design at 101 camera locations and reports a 12% reduction in fatal and injury crashes for 2015–2017, and 15% for fatality and severe injury. Sutton and Tilahun (2022) examine the program’s equity and efficacy. These studies evaluate the earlier 2013–2014 rollout; this paper evaluates later cohorts and asks how sensitive the answer is to design.</w:t>
       </w:r>
     </w:p>
     <w:p>
@@ -167,7 +841,7 @@
         <w:pStyle w:val="BodyText"/>
       </w:pPr>
       <w:r>
-        <w:t xml:space="preserve">The study makes three modest contributions: a reproducible audit that exactly reproduces the −7.3% estimate and shows it is not robust to defensible design changes; conditional Poisson and cohort 2×2 estimators that avoid negative weighting under staggered adoption; and a geographically validated forecasting layer with conformal uncertainty that is explicitly not causal evidence.</w:t>
+        <w:t xml:space="preserve">The closest recent quasi-experimental comparison is New York City. Stagoff-Belfort, Ben-Menachem and Beck (2025) exploit the staggered rollout of roughly 2,000 cameras between 2014 and 2023 and estimate reductions of about 5% per month for collisions and 2.5% per month for injuries, cumulatively about 30% and 16% over seven months. The magnitudes are larger than our revised Chicago estimate, but the programs, outcomes, periods and designs differ.</w:t>
       </w:r>
     </w:p>
     <w:p>
@@ -175,56 +849,20 @@
         <w:pStyle w:val="BodyText"/>
       </w:pPr>
       <w:r>
-        <w:t xml:space="preserve">The headline result is not a new national estimate of camera effectiveness. It is a statement about design sensitivity: the same public data, with plausible changes to matching and overlap handling, move the estimate from a statistically significant −7% to a wide interval that includes zero. That is the most defensible finding the data support.</w:t>
-      </w:r>
-    </w:p>
-    <w:p>
-      <w:r>
-        <w:pict>
-          <v:rect style="width:0;height:1.5pt" o:hralign="center" o:hrstd="t" o:hr="t"/>
-        </w:pict>
-      </w:r>
-    </w:p>
-    <w:p>
-      <w:pPr>
-        <w:pStyle w:val="Heading2"/>
-      </w:pPr>
-      <w:bookmarkStart w:id="12" w:name="_c402fc6a47ec8bb5e751ab4b29e0fc7601a51bb"/>
-      <w:r>
-        <w:t xml:space="preserve">2. Related work</w:t>
-      </w:r>
-      <w:bookmarkEnd w:id="12"/>
-    </w:p>
-    <w:p>
-      <w:pPr>
-        <w:pStyle w:val="FirstParagraph"/>
-      </w:pPr>
-      <w:r>
-        <w:t xml:space="preserve">The road-safety literature generally finds reductions in collisions and casualties near speed cameras, with weaker evidence on wider-area effects and severity. Pilkington and Kinra (2005) emphasize study quality and regression to the mean; Wilson et al. (2010) find the strongest evidence for fatal and serious injuries; Graham et al. (2019) study London and note displacement and heterogeneity.</w:t>
+        <w:t xml:space="preserve">Methodologically, Bertrand, Duflo and Mullainathan (2004) show that naive standard errors are understated under serial correlation. Goodman-Bacon (2021) and de Chaisemartin and D’Haultfœuille (2020) show that two-way fixed-effects estimands can place negative weights on staggered 2×2 comparisons; Callaway and Sant’Anna (2021) and Sun and Abraham (2021) provide group-time and event-study alternatives. Abadie, Diamond and Hainmueller (2010) develop synthetic control; Cameron, Gelbach and Miller (2008) provide small-cluster bootstrap inference; Barnett (2005) and Hauer (1997) document regression to the mean.</w:t>
       </w:r>
     </w:p>
     <w:p>
       <w:pPr>
         <w:pStyle w:val="BodyText"/>
-      </w:pPr>
-      <w:r>
-        <w:t xml:space="preserve">Chicago-specific evidence is most relevant. Tilahun (2023) uses an empirical Bayes design at 101 camera locations and reports a 12% reduction in fatal and injury crashes for 2015–2017, and 15% for fatality and severe injury. Sutton and Tilahun (2022) examine the program’s equity and efficacy. These studies evaluate the earlier 2013–2014 rollout; this paper evaluates later cohorts and asks how sensitive the answer is to design.</w:t>
-      </w:r>
-    </w:p>
-    <w:p>
-      <w:pPr>
-        <w:pStyle w:val="BodyText"/>
-      </w:pPr>
-      <w:r>
-        <w:t xml:space="preserve">The closest recent quasi-experimental comparison is New York City. Stagoff-Belfort, Ben-Menachem and Beck (2025) exploit the staggered rollout of roughly 2,000 cameras between 2014 and 2023 and estimate reductions of about 5% per month for collisions and 2.5% per month for injuries, cumulatively about 30% and 16% over seven months. The magnitudes are larger than our revised Chicago estimate, but the programs, outcomes, periods and designs differ.</w:t>
-      </w:r>
-    </w:p>
-    <w:p>
-      <w:pPr>
-        <w:pStyle w:val="BodyText"/>
-      </w:pPr>
-      <w:r>
-        <w:t xml:space="preserve">Methodologically, Bertrand, Duflo and Mullainathan (2004) show that naive standard errors are understated under serial correlation. Goodman-Bacon (2021) and de Chaisemartin and D’Haultfœuille (2020) show that two-way fixed-effects estimands can place negative weights on staggered 2×2 comparisons; Callaway and Sant’Anna (2021) and Sun and Abraham (2021) provide group-time and event-study alternatives. Abadie, Diamond and Hainmueller (2010) develop synthetic control; Cameron, Gelbach and Miller (2008) provide small-cluster bootstrap inference; Barnett (2005) and Hauer (1997) document regression to the mean.</w:t>
+        <w:keepNext/>
+      </w:pPr>
+      <w:r>
+        <w:rPr>
+          <w:b/>
+          <w:bCs/>
+        </w:rPr>
+        <w:t xml:space="preserve">Table 1. Comparison with prior studies.</w:t>
       </w:r>
     </w:p>
     <w:tbl>
@@ -629,11 +1267,11 @@
       <w:pPr>
         <w:pStyle w:val="Heading2"/>
       </w:pPr>
-      <w:bookmarkStart w:id="13" w:name="_30e2f47b23a07366d219ec852acaf92c239664a"/>
+      <w:bookmarkStart w:id="12" w:name="_30e2f47b23a07366d219ec852acaf92c239664a"/>
       <w:r>
         <w:t xml:space="preserve">3. Data and study setting</w:t>
       </w:r>
-      <w:bookmarkEnd w:id="13"/>
+      <w:bookmarkEnd w:id="12"/>
     </w:p>
     <w:p>
       <w:pPr>
@@ -740,6 +1378,19 @@
       </w:r>
       <w:r>
         <w:t xml:space="preserve">make 2015-09…2017-08 citywide: the portal states that E-Crash data are available for some districts in 2015 and citywide coverage begins in September 2017. The publication causal panel begins in 2015-09, the V1/V2 forecast target begins in 2017-01, and the coverage-consistent reconstruction uses 2017-09 history and 2018-01 targets. These are different samples and are not interchangeable.</w:t>
+      </w:r>
+    </w:p>
+    <w:p>
+      <w:pPr>
+        <w:pStyle w:val="BodyText"/>
+        <w:keepNext/>
+      </w:pPr>
+      <w:r>
+        <w:rPr>
+          <w:b/>
+          <w:bCs/>
+        </w:rPr>
+        <w:t xml:space="preserve">Table 2. Reporting-regime diagnostic.</w:t>
       </w:r>
     </w:p>
     <w:tbl>
@@ -873,7 +1524,7 @@
         <w:pStyle w:val="FirstParagraph"/>
       </w:pPr>
       <w:r>
-        <w:t xml:space="preserve">The break is shown in Figure 9, placed with the forecasting figures.</w:t>
+        <w:t xml:space="preserve">Figure 9 shows the break.</w:t>
       </w:r>
     </w:p>
     <w:p>
@@ -888,11 +1539,11 @@
       <w:pPr>
         <w:pStyle w:val="Heading3"/>
       </w:pPr>
-      <w:bookmarkStart w:id="14" w:name="_1b0a222cf90f6e181896556a68328787aae7c20"/>
+      <w:bookmarkStart w:id="13" w:name="_1b0a222cf90f6e181896556a68328787aae7c20"/>
       <w:r>
         <w:t xml:space="preserve">Study setting</w:t>
       </w:r>
-      <w:bookmarkEnd w:id="14"/>
+      <w:bookmarkEnd w:id="13"/>
     </w:p>
     <w:p>
       <w:pPr>
@@ -913,11 +1564,11 @@
       <w:pPr>
         <w:pStyle w:val="Heading2"/>
       </w:pPr>
-      <w:bookmarkStart w:id="15" w:name="_36f85afcb4e3040ae10988c13f5dc35dd13a600"/>
+      <w:bookmarkStart w:id="14" w:name="_36f85afcb4e3040ae10988c13f5dc35dd13a600"/>
       <w:r>
         <w:t xml:space="preserve">4. Causal identification strategy</w:t>
       </w:r>
-      <w:bookmarkEnd w:id="15"/>
+      <w:bookmarkEnd w:id="14"/>
     </w:p>
     <w:p>
       <w:pPr>
@@ -933,14 +1584,6 @@
       </w:pPr>
       <w:r>
         <w:t xml:space="preserve">The last assumption is the weakest. Cameras are placed where crashes were high, so regression to the mean remains a threat even after matching on pre-period level and slope. Placebo go-live dates and geographic placebos test for some forms of this bias but cannot eliminate it.</w:t>
-      </w:r>
-    </w:p>
-    <w:p>
-      <w:pPr>
-        <w:pStyle w:val="BodyText"/>
-      </w:pPr>
-      <w:r>
-        <w:t xml:space="preserve">The design proceeds in five steps.</w:t>
       </w:r>
     </w:p>
     <w:p>
@@ -1006,7 +1649,7 @@
         <w:t xml:space="preserve"> </w:t>
       </w:r>
       <w:r>
-        <w:t xml:space="preserve">Each camera gets five sites within 2,000 m, matched on pre-period level and slope in its own pre-window. The 1,000 m alternative leaves only 11 of 33 cameras with five controls; citywide matching reproduces the original behavior.</w:t>
+        <w:t xml:space="preserve">Each camera gets five sites within 2,000 m, matched on pre-period level and slope in its own pre-window. The 1,000 m alternative leaves 11 of 33 cameras with five controls; citywide matching reproduces the original.</w:t>
       </w:r>
     </w:p>
     <w:p>
@@ -1058,25 +1701,25 @@
         <w:pStyle w:val="FirstParagraph"/>
       </w:pPr>
       <w:r>
-        <w:t xml:space="preserve">The replication sample has 33 cameras and 11,880 panel rows; the primary sample has 20 cameras and 7,200 rows. Pre-period balance is good: standardized mean difference in crash level 0.14; differential pre-trend +0.007 crashes/site-month per month (95% CI −0.022 to +0.036; p = 0.62).</w:t>
+        <w:t xml:space="preserve">The replication sample has 33 cameras and 11,880 rows; the primary sample has 20 cameras and 7,200. Pre-period balance is good: standardized mean difference in crash level 0.14; differential pre-trend +0.007 crashes/site-month per month (95% CI −0.022 to +0.036; p = 0.62).</w:t>
       </w:r>
     </w:p>
     <w:p>
       <w:pPr>
         <w:pStyle w:val="Heading3"/>
       </w:pPr>
-      <w:bookmarkStart w:id="16" w:name="_431f2b78b25ed9c2cb8b8c27b6b86d3f6e57e69"/>
+      <w:bookmarkStart w:id="15" w:name="_431f2b78b25ed9c2cb8b8c27b6b86d3f6e57e69"/>
       <w:r>
         <w:t xml:space="preserve">4.6 Coverage-consistent design</w:t>
       </w:r>
-      <w:bookmarkEnd w:id="16"/>
+      <w:bookmarkEnd w:id="15"/>
     </w:p>
     <w:p>
       <w:pPr>
         <w:pStyle w:val="FirstParagraph"/>
       </w:pPr>
       <w:r>
-        <w:t xml:space="preserve">Because the publication pre-period straddles the reporting transition, we also require all 24 pre-months and 36 post-months to fall after 2017-09. This leaves</w:t>
+        <w:t xml:space="preserve">Because the publication pre-period straddles the transition, we require all 24 pre-months and 36 post-months to fall after 2017-09. This leaves</w:t>
       </w:r>
       <w:r>
         <w:t xml:space="preserve"> </w:t>
@@ -1092,18 +1735,18 @@
         <w:t xml:space="preserve"> </w:t>
       </w:r>
       <w:r>
-        <w:t xml:space="preserve">(go-live 2021-07…2023-07) and 5,400 panel rows. The design is otherwise the same local 2,000 m, overlap-removed specification. It is a new estimand on a much smaller cohort, not a replication of the 20-camera estimate. A 12-month pre-period extension yields 16 cameras; a 24-month post-period yields 18. The joint pre-trend p-value is 0.855, and the geographic placebo one-sided p-value is 0.25.</w:t>
+        <w:t xml:space="preserve">(go-live 2021-07…2023-07) and 5,400 panel rows. Otherwise the design is the same local 2,000 m, overlap-removed specification. It is a new estimand, not a replication of the 20-camera estimate. A 12-month pre-period yields 16 cameras; a 24-month post-period yields 18. Joint pre-trend p = 0.855; geographic placebo p = 0.25.</w:t>
       </w:r>
     </w:p>
     <w:p>
       <w:pPr>
         <w:pStyle w:val="Heading3"/>
       </w:pPr>
-      <w:bookmarkStart w:id="17" w:name="_e1774e10f5b7bbed372dacc509b888ac28ba2bc"/>
+      <w:bookmarkStart w:id="16" w:name="_e1774e10f5b7bbed372dacc509b888ac28ba2bc"/>
       <w:r>
         <w:t xml:space="preserve">What changed between the original and revised estimates</w:t>
       </w:r>
-      <w:bookmarkEnd w:id="17"/>
+      <w:bookmarkEnd w:id="16"/>
     </w:p>
     <w:p>
       <w:pPr>
@@ -1124,11 +1767,11 @@
       <w:pPr>
         <w:pStyle w:val="Heading2"/>
       </w:pPr>
-      <w:bookmarkStart w:id="18" w:name="_9596f1e490763ab958f23afd95c8caebb52ca9c"/>
+      <w:bookmarkStart w:id="17" w:name="_9596f1e490763ab958f23afd95c8caebb52ca9c"/>
       <w:r>
         <w:t xml:space="preserve">5. Geospatial matching and treatment definition</w:t>
       </w:r>
-      <w:bookmarkEnd w:id="18"/>
+      <w:bookmarkEnd w:id="17"/>
     </w:p>
     <w:p>
       <w:pPr>
@@ -1143,30 +1786,31 @@
         <w:pStyle w:val="BodyText"/>
       </w:pPr>
       <w:r>
-        <w:t xml:space="preserve">The 500 m lattice is a proxy for road exposure. It is not a road network. Candidate sites are screened by crash volume and active-month share, and the analysis reports posted-speed-limit balance (both camera and comparison catchments have a median of 30 mph). The lattice phase is arbitrary; the primary estimate ranges from −3.07% to −1.20% across four phases, while the citywide replication ranges from about −5.0% to −8.5%. Local matching is less phase-sensitive, which is one reason it is preferred.</w:t>
+        <w:t xml:space="preserve">The 500 m lattice is a proxy for road exposure, not a road network. Candidate sites are screened by crash volume and active-month share, and the analysis reports posted-speed-limit balance (both camera and comparison catchments have a median of 30 mph). The lattice phase is arbitrary; the primary estimate ranges from −3.07% to −1.20% across four phases, while the citywide replication ranges from about −5.0% to −8.5%. Local matching is less phase-sensitive, which is one reason it is preferred.</w:t>
       </w:r>
     </w:p>
     <w:p>
       <w:pPr>
         <w:pStyle w:val="CaptionedFigure"/>
+        <w:keepNext/>
       </w:pPr>
       <w:r>
         <w:drawing>
           <wp:inline>
-            <wp:extent cx="5334000" cy="4644787"/>
+            <wp:extent cx="5905500" cy="5142442"/>
             <wp:effectExtent b="0" l="0" r="0" t="0"/>
-            <wp:docPr descr="Camera and comparison locations" title="" id="20" name="Picture"/>
+            <wp:docPr descr="Figure 1. Chicago camera locations and matched comparison sites. Comparison sites are more than 600 m from every camera. Crash density is a 60,000-record sample." title="" id="19" name="Picture"/>
             <a:graphic>
               <a:graphicData uri="http://schemas.openxmlformats.org/drawingml/2006/picture">
                 <pic:pic>
                   <pic:nvPicPr>
-                    <pic:cNvPr descr="figures/fig1_study_map.png" id="21" name="Picture"/>
+                    <pic:cNvPr descr="figures/fig1_study_map.png" id="20" name="Picture"/>
                     <pic:cNvPicPr>
                       <a:picLocks noChangeArrowheads="1" noChangeAspect="1"/>
                     </pic:cNvPicPr>
                   </pic:nvPicPr>
                   <pic:blipFill>
-                    <a:blip r:embed="rId19"/>
+                    <a:blip r:embed="rId18"/>
                     <a:stretch>
                       <a:fillRect/>
                     </a:stretch>
@@ -1174,7 +1818,7 @@
                   <pic:spPr bwMode="auto">
                     <a:xfrm>
                       <a:off x="0" y="0"/>
-                      <a:ext cx="5334000" cy="4644787"/>
+                      <a:ext cx="5905500" cy="5142442"/>
                     </a:xfrm>
                     <a:prstGeom prst="rect">
                       <a:avLst/>
@@ -1198,42 +1842,31 @@
         <w:pStyle w:val="ImageCaption"/>
       </w:pPr>
       <w:r>
-        <w:t xml:space="preserve">Camera and comparison locations</w:t>
-      </w:r>
-    </w:p>
-    <w:p>
-      <w:pPr>
-        <w:pStyle w:val="FirstParagraph"/>
-      </w:pPr>
-      <w:r>
-        <w:rPr>
-          <w:i/>
-          <w:iCs/>
-        </w:rPr>
         <w:t xml:space="preserve">Figure 1. Chicago camera locations and matched comparison sites. Comparison sites are more than 600 m from every camera. Crash density is a 60,000-record sample.</w:t>
       </w:r>
     </w:p>
     <w:p>
       <w:pPr>
         <w:pStyle w:val="CaptionedFigure"/>
+        <w:keepNext/>
       </w:pPr>
       <w:r>
         <w:drawing>
           <wp:inline>
-            <wp:extent cx="5334000" cy="4486760"/>
+            <wp:extent cx="5905500" cy="4967484"/>
             <wp:effectExtent b="0" l="0" r="0" t="0"/>
-            <wp:docPr descr="Overlapping catchments" title="" id="23" name="Picture"/>
+            <wp:docPr descr="Figure 2. Overlapping 250 m camera catchments. Gold segments join pairs less than 500 m apart; the primary design keeps the earliest camera in each overlap chain." title="" id="22" name="Picture"/>
             <a:graphic>
               <a:graphicData uri="http://schemas.openxmlformats.org/drawingml/2006/picture">
                 <pic:pic>
                   <pic:nvPicPr>
-                    <pic:cNvPr descr="figures/fig2_catchment_overlap.png" id="24" name="Picture"/>
+                    <pic:cNvPr descr="figures/fig2_catchment_overlap.png" id="23" name="Picture"/>
                     <pic:cNvPicPr>
                       <a:picLocks noChangeArrowheads="1" noChangeAspect="1"/>
                     </pic:cNvPicPr>
                   </pic:nvPicPr>
                   <pic:blipFill>
-                    <a:blip r:embed="rId22"/>
+                    <a:blip r:embed="rId21"/>
                     <a:stretch>
                       <a:fillRect/>
                     </a:stretch>
@@ -1241,7 +1874,7 @@
                   <pic:spPr bwMode="auto">
                     <a:xfrm>
                       <a:off x="0" y="0"/>
-                      <a:ext cx="5334000" cy="4486760"/>
+                      <a:ext cx="5905500" cy="4967484"/>
                     </a:xfrm>
                     <a:prstGeom prst="rect">
                       <a:avLst/>
@@ -1265,18 +1898,6 @@
         <w:pStyle w:val="ImageCaption"/>
       </w:pPr>
       <w:r>
-        <w:t xml:space="preserve">Overlapping catchments</w:t>
-      </w:r>
-    </w:p>
-    <w:p>
-      <w:pPr>
-        <w:pStyle w:val="FirstParagraph"/>
-      </w:pPr>
-      <w:r>
-        <w:rPr>
-          <w:i/>
-          <w:iCs/>
-        </w:rPr>
         <w:t xml:space="preserve">Figure 2. Overlapping 250 m camera catchments. Gold segments join pairs less than 500 m apart; the primary design keeps the earliest camera in each overlap chain.</w:t>
       </w:r>
     </w:p>
@@ -1291,19 +1912,234 @@
       <w:pPr>
         <w:pStyle w:val="Heading2"/>
       </w:pPr>
-      <w:bookmarkStart w:id="25" w:name="_dacc03f12d14a765c3499c4321a7c20c15963a5"/>
+      <w:bookmarkStart w:id="24" w:name="_dacc03f12d14a765c3499c4321a7c20c15963a5"/>
       <w:r>
         <w:t xml:space="preserve">6. Statistical models</w:t>
       </w:r>
+      <w:bookmarkEnd w:id="24"/>
+    </w:p>
+    <w:p>
+      <w:pPr>
+        <w:pStyle w:val="Heading3"/>
+      </w:pPr>
+      <w:bookmarkStart w:id="25" w:name="_c0f0b20c866897fa23ee00e4fbcdddc8d5de5ca"/>
+      <w:r>
+        <w:t xml:space="preserve">6.1 Stacked difference-in-differences</w:t>
+      </w:r>
       <w:bookmarkEnd w:id="25"/>
     </w:p>
     <w:p>
       <w:pPr>
+        <w:pStyle w:val="FirstParagraph"/>
+      </w:pPr>
+      <w:r>
+        <w:t xml:space="preserve">The baseline specification mirrors the original notebook:</w:t>
+      </w:r>
+    </w:p>
+    <w:p>
+      <w:pPr>
+        <w:pStyle w:val="BodyText"/>
+      </w:pPr>
+      <m:oMathPara>
+        <m:oMathParaPr>
+          <m:jc m:val="center"/>
+        </m:oMathParaPr>
+        <m:oMath>
+          <m:sSub>
+            <m:e>
+              <m:r>
+                <m:t>y</m:t>
+              </m:r>
+            </m:e>
+            <m:sub>
+              <m:r>
+                <m:t>i</m:t>
+              </m:r>
+              <m:r>
+                <m:t>s</m:t>
+              </m:r>
+              <m:r>
+                <m:t>t</m:t>
+              </m:r>
+            </m:sub>
+          </m:sSub>
+          <m:r>
+            <m:rPr>
+              <m:sty m:val="p"/>
+            </m:rPr>
+            <m:t>=</m:t>
+          </m:r>
+          <m:r>
+            <m:t>α</m:t>
+          </m:r>
+          <m:r>
+            <m:rPr>
+              <m:sty m:val="p"/>
+            </m:rPr>
+            <m:t>+</m:t>
+          </m:r>
+          <m:r>
+            <m:t>β</m:t>
+          </m:r>
+          <m:r>
+            <m:t> </m:t>
+          </m:r>
+          <m:sSub>
+            <m:e>
+              <m:r>
+                <m:rPr>
+                  <m:nor/>
+                </m:rPr>
+                <m:t>treated</m:t>
+              </m:r>
+            </m:e>
+            <m:sub>
+              <m:r>
+                <m:t>i</m:t>
+              </m:r>
+            </m:sub>
+          </m:sSub>
+          <m:r>
+            <m:rPr>
+              <m:sty m:val="p"/>
+            </m:rPr>
+            <m:t>+</m:t>
+          </m:r>
+          <m:r>
+            <m:t>γ</m:t>
+          </m:r>
+          <m:r>
+            <m:t> </m:t>
+          </m:r>
+          <m:sSub>
+            <m:e>
+              <m:r>
+                <m:rPr>
+                  <m:nor/>
+                </m:rPr>
+                <m:t>post</m:t>
+              </m:r>
+            </m:e>
+            <m:sub>
+              <m:r>
+                <m:t>s</m:t>
+              </m:r>
+              <m:r>
+                <m:t>t</m:t>
+              </m:r>
+            </m:sub>
+          </m:sSub>
+          <m:r>
+            <m:rPr>
+              <m:sty m:val="p"/>
+            </m:rPr>
+            <m:t>+</m:t>
+          </m:r>
+          <m:r>
+            <m:t>τ</m:t>
+          </m:r>
+          <m:r>
+            <m:t> </m:t>
+          </m:r>
+          <m:r>
+            <m:rPr>
+              <m:sty m:val="p"/>
+            </m:rPr>
+            <m:t>(</m:t>
+          </m:r>
+          <m:sSub>
+            <m:e>
+              <m:r>
+                <m:rPr>
+                  <m:nor/>
+                </m:rPr>
+                <m:t>treated</m:t>
+              </m:r>
+            </m:e>
+            <m:sub>
+              <m:r>
+                <m:t>i</m:t>
+              </m:r>
+            </m:sub>
+          </m:sSub>
+          <m:r>
+            <m:rPr>
+              <m:sty m:val="p"/>
+            </m:rPr>
+            <m:t>×</m:t>
+          </m:r>
+          <m:sSub>
+            <m:e>
+              <m:r>
+                <m:rPr>
+                  <m:nor/>
+                </m:rPr>
+                <m:t>post</m:t>
+              </m:r>
+            </m:e>
+            <m:sub>
+              <m:r>
+                <m:t>s</m:t>
+              </m:r>
+              <m:r>
+                <m:t>t</m:t>
+              </m:r>
+            </m:sub>
+          </m:sSub>
+          <m:r>
+            <m:rPr>
+              <m:sty m:val="p"/>
+            </m:rPr>
+            <m:t>)</m:t>
+          </m:r>
+          <m:r>
+            <m:rPr>
+              <m:sty m:val="p"/>
+            </m:rPr>
+            <m:t>+</m:t>
+          </m:r>
+          <m:sSub>
+            <m:e>
+              <m:r>
+                <m:t>ε</m:t>
+              </m:r>
+            </m:e>
+            <m:sub>
+              <m:r>
+                <m:t>i</m:t>
+              </m:r>
+              <m:r>
+                <m:t>s</m:t>
+              </m:r>
+              <m:r>
+                <m:t>t</m:t>
+              </m:r>
+            </m:sub>
+          </m:sSub>
+          <m:r>
+            <m:rPr>
+              <m:sty m:val="p"/>
+            </m:rPr>
+            <m:t>,</m:t>
+          </m:r>
+        </m:oMath>
+      </m:oMathPara>
+    </w:p>
+    <w:p>
+      <w:pPr>
+        <w:pStyle w:val="FirstParagraph"/>
+      </w:pPr>
+      <w:r>
+        <w:t xml:space="preserve">estimated by OLS and Poisson with standard errors clustered by camera stack. This specification is retained as a baseline, not as the preferred causal model.</w:t>
+      </w:r>
+    </w:p>
+    <w:p>
+      <w:pPr>
         <w:pStyle w:val="Heading3"/>
       </w:pPr>
-      <w:bookmarkStart w:id="26" w:name="_c0f0b20c866897fa23ee00e4fbcdddc8d5de5ca"/>
-      <w:r>
-        <w:t xml:space="preserve">6.1 Stacked difference-in-differences</w:t>
+      <w:bookmarkStart w:id="26" w:name="_3ba1de552711c070c70d3809ebd53a98d820ce0"/>
+      <w:r>
+        <w:t xml:space="preserve">6.2 Conditional Poisson fixed effects</w:t>
       </w:r>
       <w:bookmarkEnd w:id="26"/>
     </w:p>
@@ -1312,303 +2148,936 @@
         <w:pStyle w:val="FirstParagraph"/>
       </w:pPr>
       <w:r>
-        <w:t xml:space="preserve">The baseline specification mirrors the original notebook:</w:t>
+        <w:t xml:space="preserve">The preferred count model conditions on each camera-month total. Let</w:t>
+      </w:r>
+      <w:r>
+        <w:t xml:space="preserve"> </w:t>
+      </w:r>
+      <m:oMath>
+        <m:sSub>
+          <m:e>
+            <m:r>
+              <m:t>y</m:t>
+            </m:r>
+          </m:e>
+          <m:sub>
+            <m:r>
+              <m:t>0</m:t>
+            </m:r>
+            <m:r>
+              <m:t>s</m:t>
+            </m:r>
+            <m:r>
+              <m:t>t</m:t>
+            </m:r>
+          </m:sub>
+        </m:sSub>
+      </m:oMath>
+      <w:r>
+        <w:t xml:space="preserve"> </w:t>
+      </w:r>
+      <w:r>
+        <w:t xml:space="preserve">be the treated count and</w:t>
+      </w:r>
+      <w:r>
+        <w:t xml:space="preserve"> </w:t>
+      </w:r>
+      <m:oMath>
+        <m:sSub>
+          <m:e>
+            <m:r>
+              <m:t>y</m:t>
+            </m:r>
+          </m:e>
+          <m:sub>
+            <m:r>
+              <m:t>1</m:t>
+            </m:r>
+            <m:r>
+              <m:t>s</m:t>
+            </m:r>
+            <m:r>
+              <m:t>t</m:t>
+            </m:r>
+          </m:sub>
+        </m:sSub>
+      </m:oMath>
+      <w:r>
+        <w:t xml:space="preserve"> </w:t>
+      </w:r>
+      <w:r>
+        <w:t xml:space="preserve">the sum over the five comparison sites. Conditional on</w:t>
+      </w:r>
+      <w:r>
+        <w:t xml:space="preserve"> </w:t>
+      </w:r>
+      <m:oMath>
+        <m:sSub>
+          <m:e>
+            <m:r>
+              <m:t>N</m:t>
+            </m:r>
+          </m:e>
+          <m:sub>
+            <m:r>
+              <m:t>s</m:t>
+            </m:r>
+            <m:r>
+              <m:t>t</m:t>
+            </m:r>
+          </m:sub>
+        </m:sSub>
+        <m:r>
+          <m:rPr>
+            <m:sty m:val="p"/>
+          </m:rPr>
+          <m:t>=</m:t>
+        </m:r>
+        <m:sSub>
+          <m:e>
+            <m:r>
+              <m:t>y</m:t>
+            </m:r>
+          </m:e>
+          <m:sub>
+            <m:r>
+              <m:t>0</m:t>
+            </m:r>
+            <m:r>
+              <m:t>s</m:t>
+            </m:r>
+            <m:r>
+              <m:t>t</m:t>
+            </m:r>
+          </m:sub>
+        </m:sSub>
+        <m:r>
+          <m:rPr>
+            <m:sty m:val="p"/>
+          </m:rPr>
+          <m:t>+</m:t>
+        </m:r>
+        <m:sSub>
+          <m:e>
+            <m:r>
+              <m:t>y</m:t>
+            </m:r>
+          </m:e>
+          <m:sub>
+            <m:r>
+              <m:t>1</m:t>
+            </m:r>
+            <m:r>
+              <m:t>s</m:t>
+            </m:r>
+            <m:r>
+              <m:t>t</m:t>
+            </m:r>
+          </m:sub>
+        </m:sSub>
+      </m:oMath>
+      <w:r>
+        <w:t xml:space="preserve">,</w:t>
       </w:r>
     </w:p>
     <w:p>
       <w:pPr>
         <w:pStyle w:val="BodyText"/>
       </w:pPr>
-      <w:r>
-        <w:t xml:space="preserve">[</w:t>
-      </w:r>
-      <w:r>
-        <w:t xml:space="preserve"> </w:t>
-      </w:r>
-      <w:r>
-        <w:t xml:space="preserve">y_{ist} =</w:t>
-      </w:r>
-      <w:r>
-        <w:t xml:space="preserve"> </w:t>
-      </w:r>
-      <w:r>
-        <w:t xml:space="preserve">+</w:t>
-      </w:r>
-      <w:r>
-        <w:t xml:space="preserve"> </w:t>
-      </w:r>
+      <m:oMathPara>
+        <m:oMathParaPr>
+          <m:jc m:val="center"/>
+        </m:oMathParaPr>
+        <m:oMath>
+          <m:sSub>
+            <m:e>
+              <m:r>
+                <m:t>y</m:t>
+              </m:r>
+            </m:e>
+            <m:sub>
+              <m:r>
+                <m:t>0</m:t>
+              </m:r>
+              <m:r>
+                <m:t>s</m:t>
+              </m:r>
+              <m:r>
+                <m:t>t</m:t>
+              </m:r>
+            </m:sub>
+          </m:sSub>
+          <m:r>
+            <m:rPr>
+              <m:sty m:val="p"/>
+            </m:rPr>
+            <m:t>∣</m:t>
+          </m:r>
+          <m:sSub>
+            <m:e>
+              <m:r>
+                <m:t>N</m:t>
+              </m:r>
+            </m:e>
+            <m:sub>
+              <m:r>
+                <m:t>s</m:t>
+              </m:r>
+              <m:r>
+                <m:t>t</m:t>
+              </m:r>
+            </m:sub>
+          </m:sSub>
+          <m:r>
+            <m:rPr>
+              <m:sty m:val="p"/>
+            </m:rPr>
+            <m:t>∼</m:t>
+          </m:r>
+          <m:r>
+            <m:rPr>
+              <m:nor/>
+            </m:rPr>
+            <m:t>Binomial</m:t>
+          </m:r>
+          <m:d>
+            <m:dPr>
+              <m:begChr m:val="("/>
+              <m:sepChr m:val=""/>
+              <m:endChr m:val=")"/>
+              <m:grow/>
+            </m:dPr>
+            <m:e>
+              <m:sSub>
+                <m:e>
+                  <m:r>
+                    <m:t>N</m:t>
+                  </m:r>
+                </m:e>
+                <m:sub>
+                  <m:r>
+                    <m:t>s</m:t>
+                  </m:r>
+                  <m:r>
+                    <m:t>t</m:t>
+                  </m:r>
+                </m:sub>
+              </m:sSub>
+              <m:r>
+                <m:rPr>
+                  <m:sty m:val="p"/>
+                </m:rPr>
+                <m:t>,</m:t>
+              </m:r>
+              <m:f>
+                <m:fPr>
+                  <m:type m:val="bar"/>
+                </m:fPr>
+                <m:num>
+                  <m:r>
+                    <m:rPr>
+                      <m:sty m:val="p"/>
+                    </m:rPr>
+                    <m:t>exp</m:t>
+                  </m:r>
+                  <m:r>
+                    <m:rPr>
+                      <m:sty m:val="p"/>
+                    </m:rPr>
+                    <m:t>(</m:t>
+                  </m:r>
+                  <m:sSub>
+                    <m:e>
+                      <m:r>
+                        <m:t>α</m:t>
+                      </m:r>
+                    </m:e>
+                    <m:sub>
+                      <m:r>
+                        <m:t>s</m:t>
+                      </m:r>
+                      <m:r>
+                        <m:t>t</m:t>
+                      </m:r>
+                    </m:sub>
+                  </m:sSub>
+                  <m:r>
+                    <m:rPr>
+                      <m:sty m:val="p"/>
+                    </m:rPr>
+                    <m:t>+</m:t>
+                  </m:r>
+                  <m:r>
+                    <m:t>τ</m:t>
+                  </m:r>
+                  <m:sSub>
+                    <m:e>
+                      <m:r>
+                        <m:rPr>
+                          <m:nor/>
+                        </m:rPr>
+                        <m:t>post</m:t>
+                      </m:r>
+                    </m:e>
+                    <m:sub>
+                      <m:r>
+                        <m:t>s</m:t>
+                      </m:r>
+                      <m:r>
+                        <m:t>t</m:t>
+                      </m:r>
+                    </m:sub>
+                  </m:sSub>
+                  <m:r>
+                    <m:rPr>
+                      <m:sty m:val="p"/>
+                    </m:rPr>
+                    <m:t>)</m:t>
+                  </m:r>
+                </m:num>
+                <m:den>
+                  <m:r>
+                    <m:rPr>
+                      <m:sty m:val="p"/>
+                    </m:rPr>
+                    <m:t>exp</m:t>
+                  </m:r>
+                  <m:r>
+                    <m:rPr>
+                      <m:sty m:val="p"/>
+                    </m:rPr>
+                    <m:t>(</m:t>
+                  </m:r>
+                  <m:sSub>
+                    <m:e>
+                      <m:r>
+                        <m:t>α</m:t>
+                      </m:r>
+                    </m:e>
+                    <m:sub>
+                      <m:r>
+                        <m:t>s</m:t>
+                      </m:r>
+                      <m:r>
+                        <m:t>t</m:t>
+                      </m:r>
+                    </m:sub>
+                  </m:sSub>
+                  <m:r>
+                    <m:rPr>
+                      <m:sty m:val="p"/>
+                    </m:rPr>
+                    <m:t>+</m:t>
+                  </m:r>
+                  <m:r>
+                    <m:t>τ</m:t>
+                  </m:r>
+                  <m:sSub>
+                    <m:e>
+                      <m:r>
+                        <m:rPr>
+                          <m:nor/>
+                        </m:rPr>
+                        <m:t>post</m:t>
+                      </m:r>
+                    </m:e>
+                    <m:sub>
+                      <m:r>
+                        <m:t>s</m:t>
+                      </m:r>
+                      <m:r>
+                        <m:t>t</m:t>
+                      </m:r>
+                    </m:sub>
+                  </m:sSub>
+                  <m:r>
+                    <m:rPr>
+                      <m:sty m:val="p"/>
+                    </m:rPr>
+                    <m:t>)</m:t>
+                  </m:r>
+                  <m:r>
+                    <m:rPr>
+                      <m:sty m:val="p"/>
+                    </m:rPr>
+                    <m:t>+</m:t>
+                  </m:r>
+                  <m:r>
+                    <m:t>5</m:t>
+                  </m:r>
+                </m:den>
+              </m:f>
+            </m:e>
+          </m:d>
+          <m:r>
+            <m:rPr>
+              <m:sty m:val="p"/>
+            </m:rPr>
+            <m:t>,</m:t>
+          </m:r>
+        </m:oMath>
+      </m:oMathPara>
+    </w:p>
+    <w:p>
+      <w:pPr>
+        <w:pStyle w:val="FirstParagraph"/>
+      </w:pPr>
+      <w:r>
+        <w:t xml:space="preserve">which is the exact conditional likelihood of a Poisson model with a full set of camera-by-month fixed effects. The coefficient</w:t>
+      </w:r>
+      <w:r>
+        <w:t xml:space="preserve"> </w:t>
+      </w:r>
+      <m:oMath>
+        <m:r>
+          <m:t>τ</m:t>
+        </m:r>
+      </m:oMath>
+      <w:r>
+        <w:t xml:space="preserve"> </w:t>
+      </w:r>
+      <w:r>
+        <w:t xml:space="preserve">is a log rate ratio;</w:t>
+      </w:r>
+      <w:r>
+        <w:t xml:space="preserve"> </w:t>
+      </w:r>
+      <m:oMath>
+        <m:r>
+          <m:rPr>
+            <m:sty m:val="p"/>
+          </m:rPr>
+          <m:t>exp</m:t>
+        </m:r>
+        <m:r>
+          <m:rPr>
+            <m:sty m:val="p"/>
+          </m:rPr>
+          <m:t>(</m:t>
+        </m:r>
+        <m:r>
+          <m:t>τ</m:t>
+        </m:r>
+        <m:r>
+          <m:rPr>
+            <m:sty m:val="p"/>
+          </m:rPr>
+          <m:t>)</m:t>
+        </m:r>
+        <m:r>
+          <m:rPr>
+            <m:sty m:val="p"/>
+          </m:rPr>
+          <m:t>−</m:t>
+        </m:r>
+        <m:r>
+          <m:t>1</m:t>
+        </m:r>
+      </m:oMath>
+      <w:r>
+        <w:t xml:space="preserve"> </w:t>
+      </w:r>
+      <w:r>
+        <w:t xml:space="preserve">is the percent change. This absorbs every shock shared by a camera and its comparison sites, including citywide traffic and COVID-19.</w:t>
+      </w:r>
+    </w:p>
+    <w:p>
+      <w:pPr>
+        <w:pStyle w:val="Heading3"/>
+      </w:pPr>
+      <w:bookmarkStart w:id="27" w:name="_2b5a3eb32f52c3af609056fcf18469fb2688278"/>
+      <w:r>
+        <w:t xml:space="preserve">6.3 Cohort 2×2 estimator</w:t>
+      </w:r>
+      <w:bookmarkEnd w:id="27"/>
+    </w:p>
+    <w:p>
+      <w:pPr>
+        <w:pStyle w:val="FirstParagraph"/>
+      </w:pPr>
+      <w:r>
+        <w:t xml:space="preserve">For each camera</w:t>
+      </w:r>
+      <w:r>
+        <w:t xml:space="preserve"> </w:t>
+      </w:r>
+      <m:oMath>
+        <m:r>
+          <m:t>i</m:t>
+        </m:r>
+      </m:oMath>
+      <w:r>
+        <w:t xml:space="preserve"> </w:t>
+      </w:r>
+      <w:r>
+        <w:t xml:space="preserve">and event month</w:t>
+      </w:r>
+      <w:r>
+        <w:t xml:space="preserve"> </w:t>
+      </w:r>
+      <m:oMath>
+        <m:r>
+          <m:t>e</m:t>
+        </m:r>
+        <m:r>
+          <m:rPr>
+            <m:sty m:val="p"/>
+          </m:rPr>
+          <m:t>≥</m:t>
+        </m:r>
+        <m:r>
+          <m:t>0</m:t>
+        </m:r>
+      </m:oMath>
       <w:r>
         <w:t xml:space="preserve">,</w:t>
       </w:r>
-      <w:r>
-        <w:rPr>
-          <w:i/>
-          <w:iCs/>
-        </w:rPr>
-        <w:t xml:space="preserve">i +</w:t>
-      </w:r>
-      <w:r>
-        <w:rPr>
-          <w:i/>
-          <w:iCs/>
-        </w:rPr>
-        <w:t xml:space="preserve"> </w:t>
-      </w:r>
-      <w:r>
-        <w:rPr>
-          <w:i/>
-          <w:iCs/>
-        </w:rPr>
-        <w:t xml:space="preserve">,</w:t>
-      </w:r>
-      <w:r>
-        <w:t xml:space="preserve">{st} +</w:t>
-      </w:r>
-      <w:r>
-        <w:t xml:space="preserve"> </w:t>
-      </w:r>
-      <w:r>
-        <w:t xml:space="preserve">,(</w:t>
-      </w:r>
-      <w:r>
-        <w:rPr>
-          <w:i/>
-          <w:iCs/>
-        </w:rPr>
-        <w:t xml:space="preserve">i</w:t>
-      </w:r>
-      <w:r>
-        <w:rPr>
-          <w:i/>
-          <w:iCs/>
-        </w:rPr>
-        <w:t xml:space="preserve"> </w:t>
-      </w:r>
-      <w:r>
-        <w:t xml:space="preserve">{st}) +</w:t>
-      </w:r>
-      <w:r>
-        <w:t xml:space="preserve"> </w:t>
-      </w:r>
-      <w:r>
-        <w:t xml:space="preserve">_{ist},</w:t>
-      </w:r>
-      <w:r>
-        <w:t xml:space="preserve"> </w:t>
-      </w:r>
-      <w:r>
-        <w:t xml:space="preserve">]</w:t>
-      </w:r>
     </w:p>
     <w:p>
       <w:pPr>
         <w:pStyle w:val="BodyText"/>
       </w:pPr>
-      <w:r>
-        <w:t xml:space="preserve">estimated by OLS and Poisson with standard errors clustered by camera stack. This specification is retained as a baseline, not as the preferred causal model.</w:t>
+      <m:oMathPara>
+        <m:oMathParaPr>
+          <m:jc m:val="center"/>
+        </m:oMathParaPr>
+        <m:oMath>
+          <m:sSub>
+            <m:e>
+              <m:acc>
+                <m:accPr>
+                  <m:chr m:val="̂"/>
+                </m:accPr>
+                <m:e>
+                  <m:r>
+                    <m:t>A</m:t>
+                  </m:r>
+                  <m:r>
+                    <m:t>T</m:t>
+                  </m:r>
+                  <m:r>
+                    <m:t>T</m:t>
+                  </m:r>
+                </m:e>
+              </m:acc>
+            </m:e>
+            <m:sub>
+              <m:r>
+                <m:t>i</m:t>
+              </m:r>
+            </m:sub>
+          </m:sSub>
+          <m:r>
+            <m:rPr>
+              <m:sty m:val="p"/>
+            </m:rPr>
+            <m:t>(</m:t>
+          </m:r>
+          <m:r>
+            <m:t>e</m:t>
+          </m:r>
+          <m:r>
+            <m:rPr>
+              <m:sty m:val="p"/>
+            </m:rPr>
+            <m:t>)</m:t>
+          </m:r>
+          <m:r>
+            <m:rPr>
+              <m:sty m:val="p"/>
+            </m:rPr>
+            <m:t>=</m:t>
+          </m:r>
+          <m:r>
+            <m:rPr>
+              <m:sty m:val="p"/>
+            </m:rPr>
+            <m:t>(</m:t>
+          </m:r>
+          <m:sSub>
+            <m:e>
+              <m:r>
+                <m:t>Y</m:t>
+              </m:r>
+            </m:e>
+            <m:sub>
+              <m:r>
+                <m:t>i</m:t>
+              </m:r>
+              <m:r>
+                <m:rPr>
+                  <m:sty m:val="p"/>
+                </m:rPr>
+                <m:t>,</m:t>
+              </m:r>
+              <m:sSub>
+                <m:e>
+                  <m:r>
+                    <m:t>g</m:t>
+                  </m:r>
+                </m:e>
+                <m:sub>
+                  <m:r>
+                    <m:t>i</m:t>
+                  </m:r>
+                </m:sub>
+              </m:sSub>
+              <m:r>
+                <m:rPr>
+                  <m:sty m:val="p"/>
+                </m:rPr>
+                <m:t>+</m:t>
+              </m:r>
+              <m:r>
+                <m:t>e</m:t>
+              </m:r>
+            </m:sub>
+          </m:sSub>
+          <m:r>
+            <m:rPr>
+              <m:sty m:val="p"/>
+            </m:rPr>
+            <m:t>−</m:t>
+          </m:r>
+          <m:sSub>
+            <m:e>
+              <m:r>
+                <m:t>Y</m:t>
+              </m:r>
+            </m:e>
+            <m:sub>
+              <m:r>
+                <m:t>i</m:t>
+              </m:r>
+              <m:r>
+                <m:rPr>
+                  <m:sty m:val="p"/>
+                </m:rPr>
+                <m:t>,</m:t>
+              </m:r>
+              <m:sSub>
+                <m:e>
+                  <m:r>
+                    <m:t>g</m:t>
+                  </m:r>
+                </m:e>
+                <m:sub>
+                  <m:r>
+                    <m:t>i</m:t>
+                  </m:r>
+                </m:sub>
+              </m:sSub>
+              <m:r>
+                <m:rPr>
+                  <m:sty m:val="p"/>
+                </m:rPr>
+                <m:t>−</m:t>
+              </m:r>
+              <m:r>
+                <m:t>1</m:t>
+              </m:r>
+            </m:sub>
+          </m:sSub>
+          <m:r>
+            <m:rPr>
+              <m:sty m:val="p"/>
+            </m:rPr>
+            <m:t>)</m:t>
+          </m:r>
+          <m:r>
+            <m:rPr>
+              <m:sty m:val="p"/>
+            </m:rPr>
+            <m:t>−</m:t>
+          </m:r>
+          <m:f>
+            <m:fPr>
+              <m:type m:val="bar"/>
+            </m:fPr>
+            <m:num>
+              <m:r>
+                <m:t>1</m:t>
+              </m:r>
+            </m:num>
+            <m:den>
+              <m:r>
+                <m:t>5</m:t>
+              </m:r>
+            </m:den>
+          </m:f>
+          <m:nary>
+            <m:naryPr>
+              <m:chr m:val="∑"/>
+              <m:limLoc m:val="undOvr"/>
+              <m:subHide m:val="off"/>
+              <m:supHide m:val="on"/>
+            </m:naryPr>
+            <m:sub>
+              <m:r>
+                <m:t>j</m:t>
+              </m:r>
+              <m:r>
+                <m:rPr>
+                  <m:sty m:val="p"/>
+                </m:rPr>
+                <m:t>∈</m:t>
+              </m:r>
+              <m:sSub>
+                <m:e>
+                  <m:r>
+                    <m:rPr>
+                      <m:scr m:val="script"/>
+                      <m:sty m:val="p"/>
+                    </m:rPr>
+                    <m:t>C</m:t>
+                  </m:r>
+                </m:e>
+                <m:sub>
+                  <m:r>
+                    <m:t>i</m:t>
+                  </m:r>
+                </m:sub>
+              </m:sSub>
+            </m:sub>
+            <m:sup>
+              <m:r>
+                <m:t>​</m:t>
+              </m:r>
+            </m:sup>
+            <m:e>
+              <m:r>
+                <m:rPr>
+                  <m:sty m:val="p"/>
+                </m:rPr>
+                <m:t>(</m:t>
+              </m:r>
+            </m:e>
+          </m:nary>
+          <m:sSub>
+            <m:e>
+              <m:r>
+                <m:t>Y</m:t>
+              </m:r>
+            </m:e>
+            <m:sub>
+              <m:r>
+                <m:t>j</m:t>
+              </m:r>
+              <m:r>
+                <m:rPr>
+                  <m:sty m:val="p"/>
+                </m:rPr>
+                <m:t>,</m:t>
+              </m:r>
+              <m:sSub>
+                <m:e>
+                  <m:r>
+                    <m:t>g</m:t>
+                  </m:r>
+                </m:e>
+                <m:sub>
+                  <m:r>
+                    <m:t>i</m:t>
+                  </m:r>
+                </m:sub>
+              </m:sSub>
+              <m:r>
+                <m:rPr>
+                  <m:sty m:val="p"/>
+                </m:rPr>
+                <m:t>+</m:t>
+              </m:r>
+              <m:r>
+                <m:t>e</m:t>
+              </m:r>
+            </m:sub>
+          </m:sSub>
+          <m:r>
+            <m:rPr>
+              <m:sty m:val="p"/>
+            </m:rPr>
+            <m:t>−</m:t>
+          </m:r>
+          <m:sSub>
+            <m:e>
+              <m:r>
+                <m:t>Y</m:t>
+              </m:r>
+            </m:e>
+            <m:sub>
+              <m:r>
+                <m:t>j</m:t>
+              </m:r>
+              <m:r>
+                <m:rPr>
+                  <m:sty m:val="p"/>
+                </m:rPr>
+                <m:t>,</m:t>
+              </m:r>
+              <m:sSub>
+                <m:e>
+                  <m:r>
+                    <m:t>g</m:t>
+                  </m:r>
+                </m:e>
+                <m:sub>
+                  <m:r>
+                    <m:t>i</m:t>
+                  </m:r>
+                </m:sub>
+              </m:sSub>
+              <m:r>
+                <m:rPr>
+                  <m:sty m:val="p"/>
+                </m:rPr>
+                <m:t>−</m:t>
+              </m:r>
+              <m:r>
+                <m:t>1</m:t>
+              </m:r>
+            </m:sub>
+          </m:sSub>
+          <m:r>
+            <m:rPr>
+              <m:sty m:val="p"/>
+            </m:rPr>
+            <m:t>)</m:t>
+          </m:r>
+          <m:r>
+            <m:rPr>
+              <m:sty m:val="p"/>
+            </m:rPr>
+            <m:t>,</m:t>
+          </m:r>
+        </m:oMath>
+      </m:oMathPara>
+    </w:p>
+    <w:p>
+      <w:pPr>
+        <w:pStyle w:val="FirstParagraph"/>
+      </w:pPr>
+      <w:r>
+        <w:t xml:space="preserve">where</w:t>
+      </w:r>
+      <w:r>
+        <w:t xml:space="preserve"> </w:t>
+      </w:r>
+      <m:oMath>
+        <m:sSub>
+          <m:e>
+            <m:r>
+              <m:t>g</m:t>
+            </m:r>
+          </m:e>
+          <m:sub>
+            <m:r>
+              <m:t>i</m:t>
+            </m:r>
+          </m:sub>
+        </m:sSub>
+      </m:oMath>
+      <w:r>
+        <w:t xml:space="preserve"> </w:t>
+      </w:r>
+      <w:r>
+        <w:t xml:space="preserve">is go-live and</w:t>
+      </w:r>
+      <w:r>
+        <w:t xml:space="preserve"> </w:t>
+      </w:r>
+      <m:oMath>
+        <m:sSub>
+          <m:e>
+            <m:r>
+              <m:rPr>
+                <m:scr m:val="script"/>
+                <m:sty m:val="p"/>
+              </m:rPr>
+              <m:t>C</m:t>
+            </m:r>
+          </m:e>
+          <m:sub>
+            <m:r>
+              <m:t>i</m:t>
+            </m:r>
+          </m:sub>
+        </m:sSub>
+      </m:oMath>
+      <w:r>
+        <w:t xml:space="preserve"> </w:t>
+      </w:r>
+      <w:r>
+        <w:t xml:space="preserve">are matched controls. The camera-level effect averages over</w:t>
+      </w:r>
+      <w:r>
+        <w:t xml:space="preserve"> </w:t>
+      </w:r>
+      <m:oMath>
+        <m:r>
+          <m:t>e</m:t>
+        </m:r>
+        <m:r>
+          <m:rPr>
+            <m:sty m:val="p"/>
+          </m:rPr>
+          <m:t>=</m:t>
+        </m:r>
+        <m:r>
+          <m:t>0</m:t>
+        </m:r>
+        <m:r>
+          <m:rPr>
+            <m:sty m:val="p"/>
+          </m:rPr>
+          <m:t>,</m:t>
+        </m:r>
+        <m:r>
+          <m:rPr>
+            <m:sty m:val="p"/>
+          </m:rPr>
+          <m:t>…</m:t>
+        </m:r>
+        <m:r>
+          <m:rPr>
+            <m:sty m:val="p"/>
+          </m:rPr>
+          <m:t>,</m:t>
+        </m:r>
+        <m:r>
+          <m:t>35</m:t>
+        </m:r>
+      </m:oMath>
+      <w:r>
+        <w:t xml:space="preserve">; the overall effect averages across cameras. Inference is a percentile bootstrap that resamples cameras, respecting the small number of independent treated units.</w:t>
       </w:r>
     </w:p>
     <w:p>
       <w:pPr>
         <w:pStyle w:val="Heading3"/>
       </w:pPr>
-      <w:bookmarkStart w:id="27" w:name="_3ba1de552711c070c70d3809ebd53a98d820ce0"/>
-      <w:r>
-        <w:t xml:space="preserve">6.2 Conditional Poisson fixed effects</w:t>
-      </w:r>
-      <w:bookmarkEnd w:id="27"/>
+      <w:bookmarkStart w:id="28" w:name="_d9e55e9097c7da5819343cd589c0f774c1f9e3a"/>
+      <w:r>
+        <w:t xml:space="preserve">6.4 Event study</w:t>
+      </w:r>
+      <w:bookmarkEnd w:id="28"/>
     </w:p>
     <w:p>
       <w:pPr>
         <w:pStyle w:val="FirstParagraph"/>
       </w:pPr>
       <w:r>
-        <w:t xml:space="preserve">The preferred count model conditions on each camera-month total. Let (y_{0st}) be the treated count and (y_{1st}) the sum over the five comparison sites. Conditional on (N_{st}=y_{0st}+y_{1st}),</w:t>
-      </w:r>
-    </w:p>
-    <w:p>
-      <w:pPr>
-        <w:pStyle w:val="BodyText"/>
-      </w:pPr>
-      <w:r>
-        <w:t xml:space="preserve">[</w:t>
-      </w:r>
-      <w:r>
-        <w:t xml:space="preserve"> </w:t>
-      </w:r>
-      <w:r>
-        <w:t xml:space="preserve">y_{0st}</w:t>
-      </w:r>
-      <w:r>
-        <w:t xml:space="preserve"> </w:t>
-      </w:r>
-      <w:r>
-        <w:t xml:space="preserve">N_{st}</w:t>
-      </w:r>
-      <w:r>
-        <w:t xml:space="preserve"> </w:t>
-      </w:r>
-      <w:r>
-        <w:t xml:space="preserve">(N_{st},</w:t>
-      </w:r>
-      <w:r>
-        <w:t xml:space="preserve"> </w:t>
-      </w:r>
-      <w:r>
-        <w:t xml:space="preserve">),</w:t>
-      </w:r>
-      <w:r>
-        <w:t xml:space="preserve"> </w:t>
-      </w:r>
-      <w:r>
-        <w:t xml:space="preserve">]</w:t>
-      </w:r>
-    </w:p>
-    <w:p>
-      <w:pPr>
-        <w:pStyle w:val="BodyText"/>
-      </w:pPr>
-      <w:r>
-        <w:t xml:space="preserve">which is the exact conditional likelihood of a Poisson model with a full set of camera-by-month fixed effects. The coefficient (</w:t>
-      </w:r>
-      <w:r>
-        <w:t xml:space="preserve">) is a log rate ratio; (</w:t>
-      </w:r>
-      <w:r>
-        <w:t xml:space="preserve">(</w:t>
-      </w:r>
-      <w:r>
-        <w:t xml:space="preserve">)-1) is the percent change. This absorbs every shock shared by a camera and its comparison sites, including citywide traffic and COVID-19.</w:t>
+        <w:t xml:space="preserve">Quarterly treated-by-event-time indicators are estimated with unit and camera-by-event-month fixed effects, reference quarter −1. The joint pre-trend Wald statistic uses the cluster-robust covariance. A pre-trend test can fail to reject; it cannot prove parallel trends, and with 15–20 cameras it has low power.</w:t>
       </w:r>
     </w:p>
     <w:p>
       <w:pPr>
         <w:pStyle w:val="Heading3"/>
       </w:pPr>
-      <w:bookmarkStart w:id="28" w:name="_2b5a3eb32f52c3af609056fcf18469fb2688278"/>
-      <w:r>
-        <w:t xml:space="preserve">6.3 Cohort 2×2 estimator</w:t>
-      </w:r>
-      <w:bookmarkEnd w:id="28"/>
-    </w:p>
-    <w:p>
-      <w:pPr>
-        <w:pStyle w:val="FirstParagraph"/>
-      </w:pPr>
-      <w:r>
-        <w:t xml:space="preserve">For each camera (i) and event month (e</w:t>
-      </w:r>
-      <w:r>
-        <w:t xml:space="preserve"> </w:t>
-      </w:r>
-      <w:r>
-        <w:t xml:space="preserve">),</w:t>
-      </w:r>
-    </w:p>
-    <w:p>
-      <w:pPr>
-        <w:pStyle w:val="BodyText"/>
-      </w:pPr>
-      <w:r>
-        <w:t xml:space="preserve">[</w:t>
-      </w:r>
-      <w:r>
-        <w:t xml:space="preserve"> </w:t>
-      </w:r>
-      <w:r>
-        <w:rPr>
-          <w:i/>
-          <w:iCs/>
-        </w:rPr>
-        <w:t xml:space="preserve">i(e) = (Y</w:t>
-      </w:r>
-      <w:r>
-        <w:t xml:space="preserve">{i,g_i+e}-Y_{i,g_i-1}) -</w:t>
-      </w:r>
-      <w:r>
-        <w:t xml:space="preserve"> </w:t>
-      </w:r>
-      <w:r>
-        <w:rPr>
-          <w:i/>
-          <w:iCs/>
-        </w:rPr>
-        <w:t xml:space="preserve">{j</w:t>
-      </w:r>
-      <w:r>
-        <w:rPr>
-          <w:i/>
-          <w:iCs/>
-        </w:rPr>
-        <w:t xml:space="preserve"> </w:t>
-      </w:r>
-      <w:r>
-        <w:rPr>
-          <w:i/>
-          <w:i/>
-          <w:iCs/>
-          <w:iCs/>
-        </w:rPr>
-        <w:t xml:space="preserve">i}(Y</w:t>
-      </w:r>
-      <w:r>
-        <w:rPr>
-          <w:i/>
-          <w:iCs/>
-        </w:rPr>
-        <w:t xml:space="preserve">{j,g_i+e}-Y</w:t>
-      </w:r>
-      <w:r>
-        <w:t xml:space="preserve">{j,g_i-1}),</w:t>
-      </w:r>
-      <w:r>
-        <w:t xml:space="preserve"> </w:t>
-      </w:r>
-      <w:r>
-        <w:t xml:space="preserve">]</w:t>
-      </w:r>
-    </w:p>
-    <w:p>
-      <w:pPr>
-        <w:pStyle w:val="BodyText"/>
-      </w:pPr>
-      <w:r>
-        <w:t xml:space="preserve">where (g_i) is go-live and (</w:t>
-      </w:r>
-      <w:r>
-        <w:t xml:space="preserve">_i) are matched controls. The camera-level effect averages over (e=0,</w:t>
-      </w:r>
-      <w:r>
-        <w:t xml:space="preserve">,35); the overall effect averages across cameras. Inference is a percentile bootstrap that resamples cameras, respecting the small number of independent treated units.</w:t>
-      </w:r>
-    </w:p>
-    <w:p>
-      <w:pPr>
-        <w:pStyle w:val="Heading3"/>
-      </w:pPr>
-      <w:bookmarkStart w:id="29" w:name="_d9e55e9097c7da5819343cd589c0f774c1f9e3a"/>
-      <w:r>
-        <w:t xml:space="preserve">6.4 Event study</w:t>
+      <w:bookmarkStart w:id="29" w:name="_c1768aa07361d768e9f91c3c6422f0fbfe1617f"/>
+      <w:r>
+        <w:t xml:space="preserve">6.5 Synthetic control</w:t>
       </w:r>
       <w:bookmarkEnd w:id="29"/>
-    </w:p>
-    <w:p>
-      <w:pPr>
-        <w:pStyle w:val="FirstParagraph"/>
-      </w:pPr>
-      <w:r>
-        <w:t xml:space="preserve">Quarterly treated-by-event-time indicators are estimated with unit and camera-by-event-month fixed effects, reference quarter −1. The joint pre-trend Wald statistic uses the cluster-robust covariance. A pre-trend test can fail to reject; it cannot prove parallel trends, and with 15–20 cameras it has low power.</w:t>
-      </w:r>
-    </w:p>
-    <w:p>
-      <w:pPr>
-        <w:pStyle w:val="Heading3"/>
-      </w:pPr>
-      <w:bookmarkStart w:id="30" w:name="_c1768aa07361d768e9f91c3c6422f0fbfe1617f"/>
-      <w:r>
-        <w:t xml:space="preserve">6.5 Synthetic control</w:t>
-      </w:r>
-      <w:bookmarkEnd w:id="30"/>
     </w:p>
     <w:p>
       <w:pPr>
@@ -1629,47 +3098,60 @@
       <w:pPr>
         <w:pStyle w:val="Heading2"/>
       </w:pPr>
-      <w:bookmarkStart w:id="31" w:name="_02819b6ad609c89c47d111570525e2d9ed0e0b1"/>
+      <w:bookmarkStart w:id="30" w:name="_02819b6ad609c89c47d111570525e2d9ed0e0b1"/>
       <w:r>
         <w:t xml:space="preserve">7. Causal results</w:t>
       </w:r>
+      <w:bookmarkEnd w:id="30"/>
+    </w:p>
+    <w:p>
+      <w:pPr>
+        <w:pStyle w:val="Heading3"/>
+      </w:pPr>
+      <w:bookmarkStart w:id="31" w:name="_replication"/>
+      <w:r>
+        <w:t xml:space="preserve">7.1 Replication</w:t>
+      </w:r>
       <w:bookmarkEnd w:id="31"/>
     </w:p>
     <w:p>
       <w:pPr>
+        <w:pStyle w:val="FirstParagraph"/>
+      </w:pPr>
+      <w:r>
+        <w:t xml:space="preserve">The original logic reproduces exactly on the current snapshot: 33 cameras, 11,880 panel rows, pre-period means 4.298 (comparisons) and 4.403 (cameras), OLS −0.3557 [−0.7110, −0.0005], p = 0.0497; Poisson −7.3% [−13.6%, −0.6%], p = 0.0342. The saved notebook outputs are not artifacts of a different data extract.</w:t>
+      </w:r>
+    </w:p>
+    <w:p>
+      <w:pPr>
+        <w:pStyle w:val="BodyText"/>
+      </w:pPr>
+      <w:r>
+        <w:t xml:space="preserve">Applying the corrected projection to the same 33-camera sample gives −8.58% [−14.66%, −2.07%], p = 0.0105. The projection matters, but the larger change comes from local matching and overlap removal.</w:t>
+      </w:r>
+    </w:p>
+    <w:p>
+      <w:pPr>
         <w:pStyle w:val="Heading3"/>
       </w:pPr>
-      <w:bookmarkStart w:id="32" w:name="_replication"/>
-      <w:r>
-        <w:t xml:space="preserve">7.1 Replication</w:t>
+      <w:bookmarkStart w:id="32" w:name="_05940e17768828c65a0df45e9ecdc3434f8552c"/>
+      <w:r>
+        <w:t xml:space="preserve">7.2 Primary estimates</w:t>
       </w:r>
       <w:bookmarkEnd w:id="32"/>
     </w:p>
     <w:p>
       <w:pPr>
         <w:pStyle w:val="FirstParagraph"/>
-      </w:pPr>
-      <w:r>
-        <w:t xml:space="preserve">The original logic reproduces exactly on the current snapshot: 33 cameras, 11,880 panel rows, pre-period means 4.298 (comparisons) and 4.403 (cameras), OLS −0.3557 [−0.7110, −0.0005], p = 0.0497; Poisson −7.3% [−13.6%, −0.6%], p = 0.0342. The saved notebook outputs are not artifacts of a different data extract.</w:t>
-      </w:r>
-    </w:p>
-    <w:p>
-      <w:pPr>
-        <w:pStyle w:val="BodyText"/>
-      </w:pPr>
-      <w:r>
-        <w:t xml:space="preserve">Applying the corrected projection to the same 33-camera sample gives −8.58% [−14.66%, −2.07%], p = 0.0105. The projection matters, but the larger change comes from local matching and overlap removal.</w:t>
-      </w:r>
-    </w:p>
-    <w:p>
-      <w:pPr>
-        <w:pStyle w:val="Heading3"/>
-      </w:pPr>
-      <w:bookmarkStart w:id="33" w:name="_05940e17768828c65a0df45e9ecdc3434f8552c"/>
-      <w:r>
-        <w:t xml:space="preserve">7.2 Primary estimates</w:t>
-      </w:r>
-      <w:bookmarkEnd w:id="33"/>
+        <w:keepNext/>
+      </w:pPr>
+      <w:r>
+        <w:rPr>
+          <w:b/>
+          <w:bCs/>
+        </w:rPr>
+        <w:t xml:space="preserve">Table 3. Causal estimates under the primary design.</w:t>
+      </w:r>
     </w:p>
     <w:tbl>
       <w:tblPr>
@@ -2107,24 +3589,25 @@
     <w:p>
       <w:pPr>
         <w:pStyle w:val="CaptionedFigure"/>
+        <w:keepNext/>
       </w:pPr>
       <w:r>
         <w:drawing>
           <wp:inline>
-            <wp:extent cx="5334000" cy="1435540"/>
+            <wp:extent cx="5905500" cy="1589348"/>
             <wp:effectExtent b="0" l="0" r="0" t="0"/>
-            <wp:docPr descr="Causal estimates" title="" id="35" name="Picture"/>
+            <wp:docPr descr="Figure 3. Causal estimates under alternative defensible designs, with 95% confidence intervals." title="" id="34" name="Picture"/>
             <a:graphic>
               <a:graphicData uri="http://schemas.openxmlformats.org/drawingml/2006/picture">
                 <pic:pic>
                   <pic:nvPicPr>
-                    <pic:cNvPr descr="figures/fig3_causal_estimates.png" id="36" name="Picture"/>
+                    <pic:cNvPr descr="figures/fig3_causal_estimates.png" id="35" name="Picture"/>
                     <pic:cNvPicPr>
                       <a:picLocks noChangeArrowheads="1" noChangeAspect="1"/>
                     </pic:cNvPicPr>
                   </pic:nvPicPr>
                   <pic:blipFill>
-                    <a:blip r:embed="rId34"/>
+                    <a:blip r:embed="rId33"/>
                     <a:stretch>
                       <a:fillRect/>
                     </a:stretch>
@@ -2132,7 +3615,7 @@
                   <pic:spPr bwMode="auto">
                     <a:xfrm>
                       <a:off x="0" y="0"/>
-                      <a:ext cx="5334000" cy="1435540"/>
+                      <a:ext cx="5905500" cy="1589348"/>
                     </a:xfrm>
                     <a:prstGeom prst="rect">
                       <a:avLst/>
@@ -2156,42 +3639,31 @@
         <w:pStyle w:val="ImageCaption"/>
       </w:pPr>
       <w:r>
-        <w:t xml:space="preserve">Causal estimates</w:t>
-      </w:r>
-    </w:p>
-    <w:p>
-      <w:pPr>
-        <w:pStyle w:val="FirstParagraph"/>
-      </w:pPr>
-      <w:r>
-        <w:rPr>
-          <w:i/>
-          <w:iCs/>
-        </w:rPr>
         <w:t xml:space="preserve">Figure 3. Causal estimates under alternative defensible designs, with 95% confidence intervals.</w:t>
       </w:r>
     </w:p>
     <w:p>
       <w:pPr>
         <w:pStyle w:val="CaptionedFigure"/>
+        <w:keepNext/>
       </w:pPr>
       <w:r>
         <w:drawing>
           <wp:inline>
-            <wp:extent cx="5334000" cy="2714605"/>
+            <wp:extent cx="5905500" cy="3005455"/>
             <wp:effectExtent b="0" l="0" r="0" t="0"/>
-            <wp:docPr descr="Event study" title="" id="38" name="Picture"/>
+            <wp:docPr descr="Figure 4. Quarterly event-study effects relative to the quarter before go-live." title="" id="37" name="Picture"/>
             <a:graphic>
               <a:graphicData uri="http://schemas.openxmlformats.org/drawingml/2006/picture">
                 <pic:pic>
                   <pic:nvPicPr>
-                    <pic:cNvPr descr="figures/fig4_event_study.png" id="39" name="Picture"/>
+                    <pic:cNvPr descr="figures/fig4_event_study.png" id="38" name="Picture"/>
                     <pic:cNvPicPr>
                       <a:picLocks noChangeArrowheads="1" noChangeAspect="1"/>
                     </pic:cNvPicPr>
                   </pic:nvPicPr>
                   <pic:blipFill>
-                    <a:blip r:embed="rId37"/>
+                    <a:blip r:embed="rId36"/>
                     <a:stretch>
                       <a:fillRect/>
                     </a:stretch>
@@ -2199,7 +3671,7 @@
                   <pic:spPr bwMode="auto">
                     <a:xfrm>
                       <a:off x="0" y="0"/>
-                      <a:ext cx="5334000" cy="2714605"/>
+                      <a:ext cx="5905500" cy="3005455"/>
                     </a:xfrm>
                     <a:prstGeom prst="rect">
                       <a:avLst/>
@@ -2223,42 +3695,31 @@
         <w:pStyle w:val="ImageCaption"/>
       </w:pPr>
       <w:r>
-        <w:t xml:space="preserve">Event study</w:t>
-      </w:r>
-    </w:p>
-    <w:p>
-      <w:pPr>
-        <w:pStyle w:val="FirstParagraph"/>
-      </w:pPr>
-      <w:r>
-        <w:rPr>
-          <w:i/>
-          <w:iCs/>
-        </w:rPr>
         <w:t xml:space="preserve">Figure 4. Quarterly event-study effects relative to the quarter before go-live.</w:t>
       </w:r>
     </w:p>
     <w:p>
       <w:pPr>
         <w:pStyle w:val="CaptionedFigure"/>
+        <w:keepNext/>
       </w:pPr>
       <w:r>
         <w:drawing>
           <wp:inline>
-            <wp:extent cx="5334000" cy="2683024"/>
+            <wp:extent cx="5905500" cy="2970491"/>
             <wp:effectExtent b="0" l="0" r="0" t="0"/>
-            <wp:docPr descr="Pre-treatment trends" title="" id="41" name="Picture"/>
+            <wp:docPr descr="Figure 5. Pre-treatment crash trends for camera catchments and matched comparison sites." title="" id="40" name="Picture"/>
             <a:graphic>
               <a:graphicData uri="http://schemas.openxmlformats.org/drawingml/2006/picture">
                 <pic:pic>
                   <pic:nvPicPr>
-                    <pic:cNvPr descr="figures/fig5_pretrends.png" id="42" name="Picture"/>
+                    <pic:cNvPr descr="figures/fig5_pretrends.png" id="41" name="Picture"/>
                     <pic:cNvPicPr>
                       <a:picLocks noChangeArrowheads="1" noChangeAspect="1"/>
                     </pic:cNvPicPr>
                   </pic:nvPicPr>
                   <pic:blipFill>
-                    <a:blip r:embed="rId40"/>
+                    <a:blip r:embed="rId39"/>
                     <a:stretch>
                       <a:fillRect/>
                     </a:stretch>
@@ -2266,7 +3727,7 @@
                   <pic:spPr bwMode="auto">
                     <a:xfrm>
                       <a:off x="0" y="0"/>
-                      <a:ext cx="5334000" cy="2683024"/>
+                      <a:ext cx="5905500" cy="2970491"/>
                     </a:xfrm>
                     <a:prstGeom prst="rect">
                       <a:avLst/>
@@ -2290,18 +3751,6 @@
         <w:pStyle w:val="ImageCaption"/>
       </w:pPr>
       <w:r>
-        <w:t xml:space="preserve">Pre-treatment trends</w:t>
-      </w:r>
-    </w:p>
-    <w:p>
-      <w:pPr>
-        <w:pStyle w:val="FirstParagraph"/>
-      </w:pPr>
-      <w:r>
-        <w:rPr>
-          <w:i/>
-          <w:iCs/>
-        </w:rPr>
         <w:t xml:space="preserve">Figure 5. Pre-treatment crash trends for camera catchments and matched comparison sites.</w:t>
       </w:r>
     </w:p>
@@ -2309,11 +3758,11 @@
       <w:pPr>
         <w:pStyle w:val="Heading3"/>
       </w:pPr>
-      <w:bookmarkStart w:id="43" w:name="_8021816af5fb89cfb06d79e9f07e80ceca484ab"/>
+      <w:bookmarkStart w:id="42" w:name="_8021816af5fb89cfb06d79e9f07e80ceca484ab"/>
       <w:r>
         <w:t xml:space="preserve">7.3 Coverage-consistent estimate</w:t>
       </w:r>
-      <w:bookmarkEnd w:id="43"/>
+      <w:bookmarkEnd w:id="42"/>
     </w:p>
     <w:p>
       <w:pPr>
@@ -2343,11 +3792,11 @@
       <w:pPr>
         <w:pStyle w:val="Heading3"/>
       </w:pPr>
-      <w:bookmarkStart w:id="44" w:name="_fdb247610f7fd670e11b4a5deca3dcf8f23c0fa"/>
+      <w:bookmarkStart w:id="43" w:name="_fdb247610f7fd670e11b4a5deca3dcf8f23c0fa"/>
       <w:r>
         <w:t xml:space="preserve">7.4 Synthetic control</w:t>
       </w:r>
-      <w:bookmarkEnd w:id="44"/>
+      <w:bookmarkEnd w:id="43"/>
     </w:p>
     <w:p>
       <w:pPr>
@@ -2368,11 +3817,24 @@
       <w:pPr>
         <w:pStyle w:val="Heading2"/>
       </w:pPr>
-      <w:bookmarkStart w:id="45" w:name="_a4e950194aef1e0f04f6ad140963af10bb7c501"/>
+      <w:bookmarkStart w:id="44" w:name="_a4e950194aef1e0f04f6ad140963af10bb7c501"/>
       <w:r>
         <w:t xml:space="preserve">8. Robustness and sensitivity analysis</w:t>
       </w:r>
-      <w:bookmarkEnd w:id="45"/>
+      <w:bookmarkEnd w:id="44"/>
+    </w:p>
+    <w:p>
+      <w:pPr>
+        <w:pStyle w:val="FirstParagraph"/>
+        <w:keepNext/>
+      </w:pPr>
+      <w:r>
+        <w:rPr>
+          <w:b/>
+          <w:bCs/>
+        </w:rPr>
+        <w:t xml:space="preserve">Table 4. Causal-sensitivity specifications.</w:t>
+      </w:r>
     </w:p>
     <w:tbl>
       <w:tblPr>
@@ -3551,11 +5013,11 @@
       <w:pPr>
         <w:pStyle w:val="Heading3"/>
       </w:pPr>
-      <w:bookmarkStart w:id="46" w:name="_e000ff24b3e891639828724fc00d31ab44b005b"/>
+      <w:bookmarkStart w:id="45" w:name="_e000ff24b3e891639828724fc00d31ab44b005b"/>
       <w:r>
         <w:t xml:space="preserve">Interpretation: a non-significant estimate is not proof of zero effect</w:t>
       </w:r>
-      <w:bookmarkEnd w:id="46"/>
+      <w:bookmarkEnd w:id="45"/>
     </w:p>
     <w:p>
       <w:pPr>
@@ -3576,10 +5038,28 @@
       <w:pPr>
         <w:pStyle w:val="Heading2"/>
       </w:pPr>
-      <w:bookmarkStart w:id="47" w:name="_ec3e7dd02a91f9e200b0a70aec023bdf378a6b3"/>
+      <w:bookmarkStart w:id="46" w:name="_ec3e7dd02a91f9e200b0a70aec023bdf378a6b3"/>
       <w:r>
         <w:t xml:space="preserve">9. Crash forecasting using LightGBM</w:t>
       </w:r>
+      <w:bookmarkEnd w:id="46"/>
+    </w:p>
+    <w:p>
+      <w:pPr>
+        <w:pStyle w:val="FirstParagraph"/>
+      </w:pPr>
+      <w:r>
+        <w:t xml:space="preserve">Forecasting asks a different question: expected reported crashes at a location in the next calendar month, conditional on prior history and covariates. V1/V2 use 129 camera catchments and 1,226 comparison sites (1,355 locations; 157,180 location-months, 2017-01…2026-08). That target includes eight months before citywide reporting, so we also build a coverage-consistent dataset starting in 2017-09 with targets from 2018-01.</w:t>
+      </w:r>
+    </w:p>
+    <w:p>
+      <w:pPr>
+        <w:pStyle w:val="Heading3"/>
+      </w:pPr>
+      <w:bookmarkStart w:id="47" w:name="_features"/>
+      <w:r>
+        <w:t xml:space="preserve">9.1 Features</w:t>
+      </w:r>
       <w:bookmarkEnd w:id="47"/>
     </w:p>
     <w:p>
@@ -3587,44 +5067,26 @@
         <w:pStyle w:val="FirstParagraph"/>
       </w:pPr>
       <w:r>
-        <w:t xml:space="preserve">Forecasting asks a different question: expected reported crashes at a location in the next calendar month, conditional on prior history and covariates. V1/V2 use 129 camera catchments and 1,226 comparison sites (1,355 locations; 157,180 location-months, 2017-01…2026-08). That target includes eight months before citywide reporting, so we also build a coverage-consistent dataset starting in 2017-09 with targets from 2018-01.</w:t>
+        <w:t xml:space="preserve">V1 uses 44 features: calendar and holidays; crash lags 1/2/3/6/12; rolling means and standard deviations; expanding statistics; zero, injury and severe shares; trend; lagged weather; static geography; and camera operational context. V2 adds 40 features: 24/36-month lags, seasonal ratios, shocks, months since crash/injury, citywide regime features, Gaussian-kernel neighbourhood history, and 2024 TIGER road density, class and intersection features. No XGBoost, CatBoost, random forest or neural network is trained.</w:t>
+      </w:r>
+    </w:p>
+    <w:p>
+      <w:pPr>
+        <w:pStyle w:val="BodyText"/>
+      </w:pPr>
+      <w:r>
+        <w:t xml:space="preserve">No traffic-volume feature is used. The public AADT extract begins in July 2022 and contains 2,525 segments; using it for 2017–2025 would either leak future exposure or require fabricated backfills. The earlier 2006 study is too old and sparse.</w:t>
       </w:r>
     </w:p>
     <w:p>
       <w:pPr>
         <w:pStyle w:val="Heading3"/>
       </w:pPr>
-      <w:bookmarkStart w:id="48" w:name="_features"/>
-      <w:r>
-        <w:t xml:space="preserve">9.1 Features</w:t>
+      <w:bookmarkStart w:id="48" w:name="_e131c0ccc58f4cb1c978943d6d0450970cdf565"/>
+      <w:r>
+        <w:t xml:space="preserve">9.2 Leakage, validation and coverage</w:t>
       </w:r>
       <w:bookmarkEnd w:id="48"/>
-    </w:p>
-    <w:p>
-      <w:pPr>
-        <w:pStyle w:val="FirstParagraph"/>
-      </w:pPr>
-      <w:r>
-        <w:t xml:space="preserve">V1 uses 44 features: calendar and holidays; crash lags 1/2/3/6/12; rolling means and standard deviations; expanding statistics; zero, injury and severe shares; trend; lagged weather; static geography; and camera operational context. V2 adds 40 features: 24/36-month lags, seasonal ratios, shocks, months since crash/injury, citywide regime features, Gaussian-kernel neighbourhood history, and 2024 TIGER road density, class and intersection features. No XGBoost, CatBoost, random forest or neural network is trained.</w:t>
-      </w:r>
-    </w:p>
-    <w:p>
-      <w:pPr>
-        <w:pStyle w:val="BodyText"/>
-      </w:pPr>
-      <w:r>
-        <w:t xml:space="preserve">No traffic-volume feature is used. The public AADT extract begins in July 2022 and contains 2,525 segments; using it for 2017–2025 would either leak future exposure or require fabricated backfills. The earlier 2006 study is too old and sparse.</w:t>
-      </w:r>
-    </w:p>
-    <w:p>
-      <w:pPr>
-        <w:pStyle w:val="Heading3"/>
-      </w:pPr>
-      <w:bookmarkStart w:id="49" w:name="_e131c0ccc58f4cb1c978943d6d0450970cdf565"/>
-      <w:r>
-        <w:t xml:space="preserve">9.2 Leakage, validation and coverage</w:t>
-      </w:r>
-      <w:bookmarkEnd w:id="49"/>
     </w:p>
     <w:p>
       <w:pPr>
@@ -3661,21 +5123,34 @@
       <w:pPr>
         <w:pStyle w:val="Heading2"/>
       </w:pPr>
-      <w:bookmarkStart w:id="50" w:name="_dbed7d98ba7b6baa2471b6f126ce924400506fa"/>
+      <w:bookmarkStart w:id="49" w:name="_dbed7d98ba7b6baa2471b6f126ce924400506fa"/>
       <w:r>
         <w:t xml:space="preserve">10. Prediction evaluation and uncertainty</w:t>
       </w:r>
+      <w:bookmarkEnd w:id="49"/>
+    </w:p>
+    <w:p>
+      <w:pPr>
+        <w:pStyle w:val="Heading3"/>
+      </w:pPr>
+      <w:bookmarkStart w:id="50" w:name="_f03f83afb3a2740395b168cad743bc3e27ea6a3"/>
+      <w:r>
+        <w:t xml:space="preserve">10.1 V1 versus V2</w:t>
+      </w:r>
       <w:bookmarkEnd w:id="50"/>
     </w:p>
     <w:p>
       <w:pPr>
-        <w:pStyle w:val="Heading3"/>
-      </w:pPr>
-      <w:bookmarkStart w:id="51" w:name="_f03f83afb3a2740395b168cad743bc3e27ea6a3"/>
-      <w:r>
-        <w:t xml:space="preserve">10.1 V1 versus V2</w:t>
-      </w:r>
-      <w:bookmarkEnd w:id="51"/>
+        <w:pStyle w:val="FirstParagraph"/>
+        <w:keepNext/>
+      </w:pPr>
+      <w:r>
+        <w:rPr>
+          <w:b/>
+          <w:bCs/>
+        </w:rPr>
+        <w:t xml:space="preserve">Table 5. V1 and V2 retrospective test performance.</w:t>
+      </w:r>
     </w:p>
     <w:tbl>
       <w:tblPr>
@@ -4068,24 +5543,25 @@
     <w:p>
       <w:pPr>
         <w:pStyle w:val="CaptionedFigure"/>
+        <w:keepNext/>
       </w:pPr>
       <w:r>
         <w:drawing>
           <wp:inline>
-            <wp:extent cx="5334000" cy="4371863"/>
+            <wp:extent cx="5905500" cy="4840276"/>
             <wp:effectExtent b="0" l="0" r="0" t="0"/>
-            <wp:docPr descr="Observed versus forecast" title="" id="53" name="Picture"/>
+            <wp:docPr descr="Figure 6. Deployed V1 forecasts against observed crashes on the retrospective test period." title="" id="52" name="Picture"/>
             <a:graphic>
               <a:graphicData uri="http://schemas.openxmlformats.org/drawingml/2006/picture">
                 <pic:pic>
                   <pic:nvPicPr>
-                    <pic:cNvPr descr="figures/fig6_forecast.png" id="54" name="Picture"/>
+                    <pic:cNvPr descr="figures/fig6_forecast.png" id="53" name="Picture"/>
                     <pic:cNvPicPr>
                       <a:picLocks noChangeArrowheads="1" noChangeAspect="1"/>
                     </pic:cNvPicPr>
                   </pic:nvPicPr>
                   <pic:blipFill>
-                    <a:blip r:embed="rId52"/>
+                    <a:blip r:embed="rId51"/>
                     <a:stretch>
                       <a:fillRect/>
                     </a:stretch>
@@ -4093,7 +5569,7 @@
                   <pic:spPr bwMode="auto">
                     <a:xfrm>
                       <a:off x="0" y="0"/>
-                      <a:ext cx="5334000" cy="4371863"/>
+                      <a:ext cx="5905500" cy="4840276"/>
                     </a:xfrm>
                     <a:prstGeom prst="rect">
                       <a:avLst/>
@@ -4117,37 +5593,25 @@
         <w:pStyle w:val="ImageCaption"/>
       </w:pPr>
       <w:r>
-        <w:t xml:space="preserve">Observed versus forecast</w:t>
-      </w:r>
+        <w:t xml:space="preserve">Figure 6. Deployed V1 forecasts against observed crashes on the retrospective test period.</w:t>
+      </w:r>
+    </w:p>
+    <w:p>
+      <w:pPr>
+        <w:pStyle w:val="Heading3"/>
+      </w:pPr>
+      <w:bookmarkStart w:id="54" w:name="_811eb9868c96e2ac7a1652ff638c2cb444febc0"/>
+      <w:r>
+        <w:t xml:space="preserve">10.2 Calibration and intervals</w:t>
+      </w:r>
+      <w:bookmarkEnd w:id="54"/>
     </w:p>
     <w:p>
       <w:pPr>
         <w:pStyle w:val="FirstParagraph"/>
       </w:pPr>
       <w:r>
-        <w:rPr>
-          <w:i/>
-          <w:iCs/>
-        </w:rPr>
-        <w:t xml:space="preserve">Figure 6. Deployed V1 forecasts against observed crashes on the retrospective test period.</w:t>
-      </w:r>
-    </w:p>
-    <w:p>
-      <w:pPr>
-        <w:pStyle w:val="Heading3"/>
-      </w:pPr>
-      <w:bookmarkStart w:id="55" w:name="_811eb9868c96e2ac7a1652ff638c2cb444febc0"/>
-      <w:r>
-        <w:t xml:space="preserve">10.2 Calibration and intervals</w:t>
-      </w:r>
-      <w:bookmarkEnd w:id="55"/>
-    </w:p>
-    <w:p>
-      <w:pPr>
-        <w:pStyle w:val="FirstParagraph"/>
-      </w:pPr>
-      <w:r>
-        <w:t xml:space="preserve">The model over-predicts zero-crash months and under-predicts high-crash months. V1’s top actual-crash decile has mean actual 10.99 and mean predicted 9.02; the coverage-tuned model has mean predicted 9.02 and MAE 2.922 (V1 2.897). Zero-crash MAE is 1.72 for V1 and 1.745 for coverage-tuned.</w:t>
+        <w:t xml:space="preserve">It over-predicts zero months and under-predicts high-crash months. V1’s top actual-crash decile has mean actual 10.99 and mean predicted 9.02; the coverage-tuned model has mean predicted 9.02 and MAE 2.922 (V1 2.897). Zero-crash MAE is 1.72 for V1 and 1.745 for coverage-tuned.</w:t>
       </w:r>
     </w:p>
     <w:p>
@@ -4155,13 +5619,65 @@
         <w:pStyle w:val="BodyText"/>
       </w:pPr>
       <w:r>
-        <w:t xml:space="preserve">Split-conformal intervals use the scale-normalised score (|y-</w:t>
-      </w:r>
-      <w:r>
-        <w:t xml:space="preserve">|/</w:t>
-      </w:r>
-      <w:r>
-        <w:t xml:space="preserve">), calibrated on out-of-fold rolling predictions. V1 coverage is</w:t>
+        <w:t xml:space="preserve">Split-conformal intervals use the scale-normalised score</w:t>
+      </w:r>
+      <w:r>
+        <w:t xml:space="preserve"> </w:t>
+      </w:r>
+      <m:oMath>
+        <m:r>
+          <m:rPr>
+            <m:sty m:val="p"/>
+          </m:rPr>
+          <m:t>|</m:t>
+        </m:r>
+        <m:r>
+          <m:t>y</m:t>
+        </m:r>
+        <m:r>
+          <m:rPr>
+            <m:sty m:val="p"/>
+          </m:rPr>
+          <m:t>−</m:t>
+        </m:r>
+        <m:r>
+          <m:t>μ</m:t>
+        </m:r>
+        <m:r>
+          <m:rPr>
+            <m:sty m:val="p"/>
+          </m:rPr>
+          <m:t>|</m:t>
+        </m:r>
+        <m:r>
+          <m:rPr>
+            <m:sty m:val="p"/>
+          </m:rPr>
+          <m:t>/</m:t>
+        </m:r>
+        <m:rad>
+          <m:radPr>
+            <m:degHide m:val="on"/>
+          </m:radPr>
+          <m:deg/>
+          <m:e>
+            <m:r>
+              <m:t>μ</m:t>
+            </m:r>
+            <m:r>
+              <m:rPr>
+                <m:sty m:val="p"/>
+              </m:rPr>
+              <m:t>+</m:t>
+            </m:r>
+            <m:r>
+              <m:t>1</m:t>
+            </m:r>
+          </m:e>
+        </m:rad>
+      </m:oMath>
+      <w:r>
+        <w:t xml:space="preserve">, calibrated on out-of-fold rolling predictions. V1 coverage is</w:t>
       </w:r>
       <w:r>
         <w:t xml:space="preserve"> </w:t>
@@ -4196,24 +5712,25 @@
     <w:p>
       <w:pPr>
         <w:pStyle w:val="CaptionedFigure"/>
+        <w:keepNext/>
       </w:pPr>
       <w:r>
         <w:drawing>
           <wp:inline>
-            <wp:extent cx="5334000" cy="2246298"/>
+            <wp:extent cx="5905500" cy="2486973"/>
             <wp:effectExtent b="0" l="0" r="0" t="0"/>
-            <wp:docPr descr="Calibration and high-risk errors" title="" id="57" name="Picture"/>
+            <wp:docPr descr="Figure 7. Calibration by predicted-risk decile and error by observed crash level for the deployed V1 model." title="" id="56" name="Picture"/>
             <a:graphic>
               <a:graphicData uri="http://schemas.openxmlformats.org/drawingml/2006/picture">
                 <pic:pic>
                   <pic:nvPicPr>
-                    <pic:cNvPr descr="figures/fig7_calibration_highrisk.png" id="58" name="Picture"/>
+                    <pic:cNvPr descr="figures/fig7_calibration_highrisk.png" id="57" name="Picture"/>
                     <pic:cNvPicPr>
                       <a:picLocks noChangeArrowheads="1" noChangeAspect="1"/>
                     </pic:cNvPicPr>
                   </pic:nvPicPr>
                   <pic:blipFill>
-                    <a:blip r:embed="rId56"/>
+                    <a:blip r:embed="rId55"/>
                     <a:stretch>
                       <a:fillRect/>
                     </a:stretch>
@@ -4221,7 +5738,7 @@
                   <pic:spPr bwMode="auto">
                     <a:xfrm>
                       <a:off x="0" y="0"/>
-                      <a:ext cx="5334000" cy="2246298"/>
+                      <a:ext cx="5905500" cy="2486973"/>
                     </a:xfrm>
                     <a:prstGeom prst="rect">
                       <a:avLst/>
@@ -4245,42 +5762,31 @@
         <w:pStyle w:val="ImageCaption"/>
       </w:pPr>
       <w:r>
-        <w:t xml:space="preserve">Calibration and high-risk errors</w:t>
-      </w:r>
-    </w:p>
-    <w:p>
-      <w:pPr>
-        <w:pStyle w:val="FirstParagraph"/>
-      </w:pPr>
-      <w:r>
-        <w:rPr>
-          <w:i/>
-          <w:iCs/>
-        </w:rPr>
         <w:t xml:space="preserve">Figure 7. Calibration by predicted-risk decile and error by observed crash level for the deployed V1 model.</w:t>
       </w:r>
     </w:p>
     <w:p>
       <w:pPr>
         <w:pStyle w:val="CaptionedFigure"/>
+        <w:keepNext/>
       </w:pPr>
       <w:r>
         <w:drawing>
           <wp:inline>
-            <wp:extent cx="5334000" cy="1972619"/>
+            <wp:extent cx="5905500" cy="2183971"/>
             <wp:effectExtent b="0" l="0" r="0" t="0"/>
-            <wp:docPr descr="Interval coverage" title="" id="60" name="Picture"/>
+            <wp:docPr descr="Figure 8. Conformal 90% interval coverage by predicted-risk decile for deployed V1." title="" id="59" name="Picture"/>
             <a:graphic>
               <a:graphicData uri="http://schemas.openxmlformats.org/drawingml/2006/picture">
                 <pic:pic>
                   <pic:nvPicPr>
-                    <pic:cNvPr descr="figures/fig8_interval_coverage.png" id="61" name="Picture"/>
+                    <pic:cNvPr descr="figures/fig8_interval_coverage.png" id="60" name="Picture"/>
                     <pic:cNvPicPr>
                       <a:picLocks noChangeArrowheads="1" noChangeAspect="1"/>
                     </pic:cNvPicPr>
                   </pic:nvPicPr>
                   <pic:blipFill>
-                    <a:blip r:embed="rId59"/>
+                    <a:blip r:embed="rId58"/>
                     <a:stretch>
                       <a:fillRect/>
                     </a:stretch>
@@ -4288,7 +5794,7 @@
                   <pic:spPr bwMode="auto">
                     <a:xfrm>
                       <a:off x="0" y="0"/>
-                      <a:ext cx="5334000" cy="1972619"/>
+                      <a:ext cx="5905500" cy="2183971"/>
                     </a:xfrm>
                     <a:prstGeom prst="rect">
                       <a:avLst/>
@@ -4312,42 +5818,31 @@
         <w:pStyle w:val="ImageCaption"/>
       </w:pPr>
       <w:r>
-        <w:t xml:space="preserve">Interval coverage</w:t>
-      </w:r>
-    </w:p>
-    <w:p>
-      <w:pPr>
-        <w:pStyle w:val="FirstParagraph"/>
-      </w:pPr>
-      <w:r>
-        <w:rPr>
-          <w:i/>
-          <w:iCs/>
-        </w:rPr>
         <w:t xml:space="preserve">Figure 8. Conformal 90% interval coverage by predicted-risk decile for deployed V1.</w:t>
       </w:r>
     </w:p>
     <w:p>
       <w:pPr>
         <w:pStyle w:val="CaptionedFigure"/>
+        <w:keepNext/>
       </w:pPr>
       <w:r>
         <w:drawing>
           <wp:inline>
-            <wp:extent cx="5334000" cy="2206653"/>
+            <wp:extent cx="5905500" cy="2443080"/>
             <wp:effectExtent b="0" l="0" r="0" t="0"/>
-            <wp:docPr descr="Reporting coverage" title="" id="63" name="Picture"/>
+            <wp:docPr descr="Figure 9. The September 2017 citywide reporting break. All 22 CPD districts have at least one record in every month from 2015-09 onward, so district presence alone is not a completeness measure." title="" id="62" name="Picture"/>
             <a:graphic>
               <a:graphicData uri="http://schemas.openxmlformats.org/drawingml/2006/picture">
                 <pic:pic>
                   <pic:nvPicPr>
-                    <pic:cNvPr descr="figures/fig9_reporting_coverage.png" id="64" name="Picture"/>
+                    <pic:cNvPr descr="figures/fig9_reporting_coverage.png" id="63" name="Picture"/>
                     <pic:cNvPicPr>
                       <a:picLocks noChangeArrowheads="1" noChangeAspect="1"/>
                     </pic:cNvPicPr>
                   </pic:nvPicPr>
                   <pic:blipFill>
-                    <a:blip r:embed="rId62"/>
+                    <a:blip r:embed="rId61"/>
                     <a:stretch>
                       <a:fillRect/>
                     </a:stretch>
@@ -4355,7 +5850,7 @@
                   <pic:spPr bwMode="auto">
                     <a:xfrm>
                       <a:off x="0" y="0"/>
-                      <a:ext cx="5334000" cy="2206653"/>
+                      <a:ext cx="5905500" cy="2443080"/>
                     </a:xfrm>
                     <a:prstGeom prst="rect">
                       <a:avLst/>
@@ -4379,37 +5874,38 @@
         <w:pStyle w:val="ImageCaption"/>
       </w:pPr>
       <w:r>
-        <w:t xml:space="preserve">Reporting coverage</w:t>
-      </w:r>
+        <w:t xml:space="preserve">Figure 9. The September 2017 citywide reporting break. All 22 CPD districts have at least one record in every month from 2015-09 onward, so district presence alone is not a completeness measure.</w:t>
+      </w:r>
+    </w:p>
+    <w:p>
+      <w:pPr>
+        <w:pStyle w:val="Heading3"/>
+      </w:pPr>
+      <w:bookmarkStart w:id="64" w:name="_fcff8a7cb134775cd2f7ce92208accb6689fe62"/>
+      <w:r>
+        <w:t xml:space="preserve">10.3 Coverage-consistent comparison</w:t>
+      </w:r>
+      <w:bookmarkEnd w:id="64"/>
     </w:p>
     <w:p>
       <w:pPr>
         <w:pStyle w:val="FirstParagraph"/>
       </w:pPr>
       <w:r>
-        <w:rPr>
-          <w:i/>
-          <w:iCs/>
-        </w:rPr>
-        <w:t xml:space="preserve">Figure 9. The September 2017 citywide reporting break. All 22 CPD districts have at least one record in every month from 2015-09 onward, so district presence alone is not a completeness measure.</w:t>
-      </w:r>
-    </w:p>
-    <w:p>
-      <w:pPr>
-        <w:pStyle w:val="Heading3"/>
-      </w:pPr>
-      <w:bookmarkStart w:id="65" w:name="_fcff8a7cb134775cd2f7ce92208accb6689fe62"/>
-      <w:r>
-        <w:t xml:space="preserve">10.3 Coverage-consistent comparison</w:t>
-      </w:r>
-      <w:bookmarkEnd w:id="65"/>
-    </w:p>
-    <w:p>
-      <w:pPr>
-        <w:pStyle w:val="FirstParagraph"/>
-      </w:pPr>
-      <w:r>
         <w:t xml:space="preserve">The coverage-tuned model (78 features, 8 Optuna trials) reaches test MAE 1.5775 and deviance 1.2162 on the same 15,912 common rows, versus V1 1.5860 and 1.2242. Its validation deviance 1.2165 is 0.48% better than coverage V1—below the 1% rule. The paired spatial-block bootstrap deviance difference is −0.0080 [−0.0114, −0.0043]. It is slightly worse than coverage V1 on the geographic holdout (1.2267 vs 1.2257), so it is not deployed.</w:t>
+      </w:r>
+    </w:p>
+    <w:p>
+      <w:pPr>
+        <w:pStyle w:val="BodyText"/>
+        <w:keepNext/>
+      </w:pPr>
+      <w:r>
+        <w:rPr>
+          <w:b/>
+          <w:bCs/>
+        </w:rPr>
+        <w:t xml:space="preserve">Table 6. Common-row model comparison.</w:t>
       </w:r>
     </w:p>
     <w:tbl>
@@ -4798,24 +6294,25 @@
     <w:p>
       <w:pPr>
         <w:pStyle w:val="CaptionedFigure"/>
+        <w:keepNext/>
       </w:pPr>
       <w:r>
         <w:drawing>
           <wp:inline>
-            <wp:extent cx="5334000" cy="2338138"/>
+            <wp:extent cx="5905500" cy="2588653"/>
             <wp:effectExtent b="0" l="0" r="0" t="0"/>
-            <wp:docPr descr="Common-row model comparison" title="" id="67" name="Picture"/>
+            <wp:docPr descr="Figure 10. All models on 15,912 common camera-zone test rows. V1 remains deployed because the pre-declared 1% rule is not met." title="" id="66" name="Picture"/>
             <a:graphic>
               <a:graphicData uri="http://schemas.openxmlformats.org/drawingml/2006/picture">
                 <pic:pic>
                   <pic:nvPicPr>
-                    <pic:cNvPr descr="figures/fig10_model_comparison.png" id="68" name="Picture"/>
+                    <pic:cNvPr descr="figures/fig10_model_comparison.png" id="67" name="Picture"/>
                     <pic:cNvPicPr>
                       <a:picLocks noChangeArrowheads="1" noChangeAspect="1"/>
                     </pic:cNvPicPr>
                   </pic:nvPicPr>
                   <pic:blipFill>
-                    <a:blip r:embed="rId66"/>
+                    <a:blip r:embed="rId65"/>
                     <a:stretch>
                       <a:fillRect/>
                     </a:stretch>
@@ -4823,7 +6320,7 @@
                   <pic:spPr bwMode="auto">
                     <a:xfrm>
                       <a:off x="0" y="0"/>
-                      <a:ext cx="5334000" cy="2338138"/>
+                      <a:ext cx="5905500" cy="2588653"/>
                     </a:xfrm>
                     <a:prstGeom prst="rect">
                       <a:avLst/>
@@ -4847,18 +6344,6 @@
         <w:pStyle w:val="ImageCaption"/>
       </w:pPr>
       <w:r>
-        <w:t xml:space="preserve">Common-row model comparison</w:t>
-      </w:r>
-    </w:p>
-    <w:p>
-      <w:pPr>
-        <w:pStyle w:val="FirstParagraph"/>
-      </w:pPr>
-      <w:r>
-        <w:rPr>
-          <w:i/>
-          <w:iCs/>
-        </w:rPr>
         <w:t xml:space="preserve">Figure 10. All models on 15,912 common camera-zone test rows. V1 remains deployed because the pre-declared 1% rule is not met.</w:t>
       </w:r>
     </w:p>
@@ -4866,11 +6351,11 @@
       <w:pPr>
         <w:pStyle w:val="Heading3"/>
       </w:pPr>
-      <w:bookmarkStart w:id="69" w:name="_defca59fa7c6e6e067adf59ecdeeae8196246f4"/>
+      <w:bookmarkStart w:id="68" w:name="_defca59fa7c6e6e067adf59ecdeeae8196246f4"/>
       <w:r>
         <w:t xml:space="preserve">10.4 Road-segment experiment</w:t>
       </w:r>
-      <w:bookmarkEnd w:id="69"/>
+      <w:bookmarkEnd w:id="68"/>
     </w:p>
     <w:p>
       <w:pPr>
@@ -4896,24 +6381,25 @@
     <w:p>
       <w:pPr>
         <w:pStyle w:val="CaptionedFigure"/>
+        <w:keepNext/>
       </w:pPr>
       <w:r>
         <w:drawing>
           <wp:inline>
-            <wp:extent cx="5334000" cy="2590535"/>
+            <wp:extent cx="5905500" cy="2868092"/>
             <wp:effectExtent b="0" l="0" r="0" t="0"/>
-            <wp:docPr descr="Road-task intervals" title="" id="71" name="Picture"/>
+            <wp:docPr descr="Figure 11. Road-segment interval coverage by predicted-risk decile. The task is predictive only." title="" id="70" name="Picture"/>
             <a:graphic>
               <a:graphicData uri="http://schemas.openxmlformats.org/drawingml/2006/picture">
                 <pic:pic>
                   <pic:nvPicPr>
-                    <pic:cNvPr descr="figures/fig11_road_intervals.png" id="72" name="Picture"/>
+                    <pic:cNvPr descr="figures/fig11_road_intervals.png" id="71" name="Picture"/>
                     <pic:cNvPicPr>
                       <a:picLocks noChangeArrowheads="1" noChangeAspect="1"/>
                     </pic:cNvPicPr>
                   </pic:nvPicPr>
                   <pic:blipFill>
-                    <a:blip r:embed="rId70"/>
+                    <a:blip r:embed="rId69"/>
                     <a:stretch>
                       <a:fillRect/>
                     </a:stretch>
@@ -4921,7 +6407,7 @@
                   <pic:spPr bwMode="auto">
                     <a:xfrm>
                       <a:off x="0" y="0"/>
-                      <a:ext cx="5334000" cy="2590535"/>
+                      <a:ext cx="5905500" cy="2868092"/>
                     </a:xfrm>
                     <a:prstGeom prst="rect">
                       <a:avLst/>
@@ -4945,18 +6431,6 @@
         <w:pStyle w:val="ImageCaption"/>
       </w:pPr>
       <w:r>
-        <w:t xml:space="preserve">Road-task intervals</w:t>
-      </w:r>
-    </w:p>
-    <w:p>
-      <w:pPr>
-        <w:pStyle w:val="FirstParagraph"/>
-      </w:pPr>
-      <w:r>
-        <w:rPr>
-          <w:i/>
-          <w:iCs/>
-        </w:rPr>
         <w:t xml:space="preserve">Figure 11. Road-segment interval coverage by predicted-risk decile. The task is predictive only.</w:t>
       </w:r>
     </w:p>
@@ -4964,11 +6438,11 @@
       <w:pPr>
         <w:pStyle w:val="Heading3"/>
       </w:pPr>
-      <w:bookmarkStart w:id="73" w:name="_1fb35943a840e4802586f301c190d8aa75f5444"/>
+      <w:bookmarkStart w:id="72" w:name="_1fb35943a840e4802586f301c190d8aa75f5444"/>
       <w:r>
         <w:t xml:space="preserve">10.5 Recursive deployment scenario</w:t>
       </w:r>
-      <w:bookmarkEnd w:id="73"/>
+      <w:bookmarkEnd w:id="72"/>
     </w:p>
     <w:p>
       <w:pPr>
@@ -4989,11 +6463,11 @@
       <w:pPr>
         <w:pStyle w:val="Heading2"/>
       </w:pPr>
-      <w:bookmarkStart w:id="74" w:name="_discussion"/>
+      <w:bookmarkStart w:id="73" w:name="_discussion"/>
       <w:r>
         <w:t xml:space="preserve">11. Discussion</w:t>
       </w:r>
-      <w:bookmarkEnd w:id="74"/>
+      <w:bookmarkEnd w:id="73"/>
     </w:p>
     <w:p>
       <w:pPr>
@@ -5046,11 +6520,11 @@
       <w:pPr>
         <w:pStyle w:val="Heading2"/>
       </w:pPr>
-      <w:bookmarkStart w:id="75" w:name="_limitations"/>
+      <w:bookmarkStart w:id="74" w:name="_limitations"/>
       <w:r>
         <w:t xml:space="preserve">12. Limitations</w:t>
       </w:r>
-      <w:bookmarkEnd w:id="75"/>
+      <w:bookmarkEnd w:id="74"/>
     </w:p>
     <w:p>
       <w:pPr>
@@ -5415,11 +6889,11 @@
       <w:pPr>
         <w:pStyle w:val="Heading2"/>
       </w:pPr>
-      <w:bookmarkStart w:id="76" w:name="_conclusion"/>
+      <w:bookmarkStart w:id="75" w:name="_conclusion"/>
       <w:r>
         <w:t xml:space="preserve">13. Conclusion</w:t>
       </w:r>
-      <w:bookmarkEnd w:id="76"/>
+      <w:bookmarkEnd w:id="75"/>
     </w:p>
     <w:p>
       <w:pPr>
@@ -5440,11 +6914,11 @@
       <w:pPr>
         <w:pStyle w:val="Heading2"/>
       </w:pPr>
-      <w:bookmarkStart w:id="77" w:name="_references"/>
+      <w:bookmarkStart w:id="76" w:name="_references"/>
       <w:r>
         <w:t xml:space="preserve">References</w:t>
       </w:r>
-      <w:bookmarkEnd w:id="77"/>
+      <w:bookmarkEnd w:id="76"/>
     </w:p>
     <w:p>
       <w:pPr>
@@ -5966,11 +7440,11 @@
       <w:pPr>
         <w:pStyle w:val="Heading2"/>
       </w:pPr>
-      <w:bookmarkStart w:id="78" w:name="_ef4299d1cf613461f4f6a91814f6e5275081461"/>
+      <w:bookmarkStart w:id="77" w:name="_ef4299d1cf613461f4f6a91814f6e5275081461"/>
       <w:r>
         <w:t xml:space="preserve">Appendix A — Reproducibility</w:t>
       </w:r>
-      <w:bookmarkEnd w:id="78"/>
+      <w:bookmarkEnd w:id="77"/>
     </w:p>
     <w:p>
       <w:pPr>
@@ -6737,9 +8211,14 @@
       </w:r>
     </w:p>
     <w:sectPr>
+      <w:headerReference w:type="default" r:id="rId12"/>
+      <w:footerReference w:type="default" r:id="rId13"/>
       <w:footnotePr>
         <w:numRestart w:val="eachSect"/>
       </w:footnotePr>
+      <w:pgSz w:w="12240" w:h="15840"/>
+      <w:pgMar w:top="1325" w:bottom="1325" w:left="1469" w:right="1469"/>
+      <w:pgNumType w:start="1"/>
     </w:sectPr>
   </w:body>
 </w:document>
@@ -6749,6 +8228,40 @@
 <w:comments xmlns:w="http://schemas.openxmlformats.org/wordprocessingml/2006/main" xmlns:m="http://schemas.openxmlformats.org/officeDocument/2006/math" xmlns:r="http://schemas.openxmlformats.org/officeDocument/2006/relationships" xmlns:o="urn:schemas-microsoft-com:office:office" xmlns:v="urn:schemas-microsoft-com:vml" xmlns:w10="urn:schemas-microsoft-com:office:word" xmlns:a="http://schemas.openxmlformats.org/drawingml/2006/main" xmlns:pic="http://schemas.openxmlformats.org/drawingml/2006/picture" xmlns:wp="http://schemas.openxmlformats.org/drawingml/2006/wordprocessingDrawing"/>
 </file>
 
+<file path=word/footer1.xml><?xml version="1.0" encoding="utf-8"?>
+<w:ftr xmlns:m="http://schemas.openxmlformats.org/officeDocument/2006/math" xmlns:mc="http://schemas.openxmlformats.org/markup-compatibility/2006" xmlns:mo="http://schemas.microsoft.com/office/mac/office/2008/main" xmlns:mv="urn:schemas-microsoft-com:mac:vml" xmlns:o="urn:schemas-microsoft-com:office:office" xmlns:r="http://schemas.openxmlformats.org/officeDocument/2006/relationships" xmlns:v="urn:schemas-microsoft-com:vml" xmlns:w10="urn:schemas-microsoft-com:office:word" xmlns:w14="http://schemas.microsoft.com/office/word/2010/wordml" xmlns:w="http://schemas.openxmlformats.org/wordprocessingml/2006/main" xmlns:wne="http://schemas.microsoft.com/office/word/2006/wordml" xmlns:wp14="http://schemas.microsoft.com/office/word/2010/wordprocessingDrawing" xmlns:wp="http://schemas.openxmlformats.org/drawingml/2006/wordprocessingDrawing" xmlns:wpc="http://schemas.microsoft.com/office/word/2010/wordprocessingCanvas" xmlns:wpg="http://schemas.microsoft.com/office/word/2010/wordprocessingGroup" xmlns:wpi="http://schemas.microsoft.com/office/word/2010/wordprocessingInk" xmlns:wps="http://schemas.microsoft.com/office/word/2010/wordprocessingShape" mc:Ignorable="w14 wp14">
+  <w:p>
+    <w:pPr>
+      <w:pStyle w:val="Footer"/>
+    </w:pPr>
+    <w:r/>
+  </w:p>
+</w:ftr>
+</file>
+
+<file path=word/footer2.xml><?xml version="1.0" encoding="utf-8"?>
+<w:ftr xmlns:m="http://schemas.openxmlformats.org/officeDocument/2006/math" xmlns:mc="http://schemas.openxmlformats.org/markup-compatibility/2006" xmlns:mo="http://schemas.microsoft.com/office/mac/office/2008/main" xmlns:mv="urn:schemas-microsoft-com:mac:vml" xmlns:o="urn:schemas-microsoft-com:office:office" xmlns:r="http://schemas.openxmlformats.org/officeDocument/2006/relationships" xmlns:v="urn:schemas-microsoft-com:vml" xmlns:w10="urn:schemas-microsoft-com:office:word" xmlns:w14="http://schemas.microsoft.com/office/word/2010/wordml" xmlns:w="http://schemas.openxmlformats.org/wordprocessingml/2006/main" xmlns:wne="http://schemas.microsoft.com/office/word/2006/wordml" xmlns:wp14="http://schemas.microsoft.com/office/word/2010/wordprocessingDrawing" xmlns:wp="http://schemas.openxmlformats.org/drawingml/2006/wordprocessingDrawing" xmlns:wpc="http://schemas.microsoft.com/office/word/2010/wordprocessingCanvas" xmlns:wpg="http://schemas.microsoft.com/office/word/2010/wordprocessingGroup" xmlns:wpi="http://schemas.microsoft.com/office/word/2010/wordprocessingInk" xmlns:wps="http://schemas.microsoft.com/office/word/2010/wordprocessingShape" mc:Ignorable="w14 wp14">
+  <w:p>
+    <w:pPr>
+      <w:pStyle w:val="Footer"/>
+      <w:jc w:val="center"/>
+    </w:pPr>
+    <w:r/>
+    <w:r>
+      <w:fldChar w:fldCharType="begin" w:dirty="true"/>
+      <w:instrText xml:space="preserve">PAGE</w:instrText>
+      <w:fldChar w:fldCharType="separate"/>
+    </w:r>
+    <w:r>
+      <w:t>1</w:t>
+    </w:r>
+    <w:r>
+      <w:fldChar w:fldCharType="end"/>
+    </w:r>
+  </w:p>
+</w:ftr>
+</file>
+
 <file path=word/footnotes.xml><?xml version="1.0" encoding="utf-8"?>
 <w:footnotes xmlns:w="http://schemas.openxmlformats.org/wordprocessingml/2006/main" xmlns:m="http://schemas.openxmlformats.org/officeDocument/2006/math" xmlns:r="http://schemas.openxmlformats.org/officeDocument/2006/relationships" xmlns:o="urn:schemas-microsoft-com:office:office" xmlns:v="urn:schemas-microsoft-com:vml" xmlns:w10="urn:schemas-microsoft-com:office:word" xmlns:a="http://schemas.openxmlformats.org/drawingml/2006/main" xmlns:pic="http://schemas.openxmlformats.org/drawingml/2006/picture" xmlns:wp="http://schemas.openxmlformats.org/drawingml/2006/wordprocessingDrawing">
   <w:footnote w:type="continuationSeparator" w:id="0">
@@ -6766,6 +8279,39 @@
     </w:p>
   </w:footnote>
 </w:footnotes>
+</file>
+
+<file path=word/header1.xml><?xml version="1.0" encoding="utf-8"?>
+<w:hdr xmlns:m="http://schemas.openxmlformats.org/officeDocument/2006/math" xmlns:mc="http://schemas.openxmlformats.org/markup-compatibility/2006" xmlns:mo="http://schemas.microsoft.com/office/mac/office/2008/main" xmlns:mv="urn:schemas-microsoft-com:mac:vml" xmlns:o="urn:schemas-microsoft-com:office:office" xmlns:r="http://schemas.openxmlformats.org/officeDocument/2006/relationships" xmlns:v="urn:schemas-microsoft-com:vml" xmlns:w10="urn:schemas-microsoft-com:office:word" xmlns:w14="http://schemas.microsoft.com/office/word/2010/wordml" xmlns:w="http://schemas.openxmlformats.org/wordprocessingml/2006/main" xmlns:wne="http://schemas.microsoft.com/office/word/2006/wordml" xmlns:wp14="http://schemas.microsoft.com/office/word/2010/wordprocessingDrawing" xmlns:wp="http://schemas.openxmlformats.org/drawingml/2006/wordprocessingDrawing" xmlns:wpc="http://schemas.microsoft.com/office/word/2010/wordprocessingCanvas" xmlns:wpg="http://schemas.microsoft.com/office/word/2010/wordprocessingGroup" xmlns:wpi="http://schemas.microsoft.com/office/word/2010/wordprocessingInk" xmlns:wps="http://schemas.microsoft.com/office/word/2010/wordprocessingShape" mc:Ignorable="w14 wp14">
+  <w:p>
+    <w:pPr>
+      <w:pStyle w:val="Header"/>
+    </w:pPr>
+    <w:r/>
+  </w:p>
+</w:hdr>
+</file>
+
+<file path=word/header2.xml><?xml version="1.0" encoding="utf-8"?>
+<w:hdr xmlns:m="http://schemas.openxmlformats.org/officeDocument/2006/math" xmlns:mc="http://schemas.openxmlformats.org/markup-compatibility/2006" xmlns:mo="http://schemas.microsoft.com/office/mac/office/2008/main" xmlns:mv="urn:schemas-microsoft-com:mac:vml" xmlns:o="urn:schemas-microsoft-com:office:office" xmlns:r="http://schemas.openxmlformats.org/officeDocument/2006/relationships" xmlns:v="urn:schemas-microsoft-com:vml" xmlns:w10="urn:schemas-microsoft-com:office:word" xmlns:w14="http://schemas.microsoft.com/office/word/2010/wordml" xmlns:w="http://schemas.openxmlformats.org/wordprocessingml/2006/main" xmlns:wne="http://schemas.microsoft.com/office/word/2006/wordml" xmlns:wp14="http://schemas.microsoft.com/office/word/2010/wordprocessingDrawing" xmlns:wp="http://schemas.openxmlformats.org/drawingml/2006/wordprocessingDrawing" xmlns:wpc="http://schemas.microsoft.com/office/word/2010/wordprocessingCanvas" xmlns:wpg="http://schemas.microsoft.com/office/word/2010/wordprocessingGroup" xmlns:wpi="http://schemas.microsoft.com/office/word/2010/wordprocessingInk" xmlns:wps="http://schemas.microsoft.com/office/word/2010/wordprocessingShape" mc:Ignorable="w14 wp14">
+  <w:p>
+    <w:pPr>
+      <w:pStyle w:val="Header"/>
+      <w:jc w:val="right"/>
+    </w:pPr>
+    <w:r/>
+    <w:r>
+      <w:rPr>
+        <w:rFonts w:ascii="Avenir Next" w:hAnsi="Avenir Next"/>
+        <w:b w:val="0"/>
+        <w:caps w:val="0"/>
+        <w:color w:val="5D6772"/>
+        <w:sz w:val="15"/>
+      </w:rPr>
+      <w:t>Do Speed Cameras Make Chicago Safer?  ·  Donepudi &amp; Kakumani</w:t>
+    </w:r>
+  </w:p>
+</w:hdr>
 </file>
 
 <file path=word/numbering.xml><?xml version="1.0" encoding="utf-8"?>
@@ -7124,6 +8670,13 @@
   <w:style w:type="paragraph" w:default="1" w:styleId="Normal">
     <w:name w:val="Normal"/>
     <w:qFormat/>
+    <w:rPr>
+      <w:rFonts w:ascii="Georgia" w:hAnsi="Georgia"/>
+      <w:b w:val="0"/>
+      <w:i w:val="0"/>
+      <w:color w:val="2B2F33"/>
+      <w:sz w:val="20"/>
+    </w:rPr>
   </w:style>
   <w:style w:type="paragraph" w:styleId="BodyText">
     <w:name w:val="Body Text"/>
@@ -7133,12 +8686,26 @@
     <w:pPr>
       <w:spacing w:before="180" w:after="180"/>
     </w:pPr>
+    <w:rPr>
+      <w:rFonts w:ascii="Georgia" w:hAnsi="Georgia"/>
+      <w:b w:val="0"/>
+      <w:i w:val="0"/>
+      <w:color w:val="2B2F33"/>
+      <w:sz w:val="20"/>
+    </w:rPr>
   </w:style>
   <w:style w:type="paragraph" w:customStyle="1" w:styleId="FirstParagraph">
     <w:name w:val="First Paragraph"/>
     <w:basedOn w:val="BodyText"/>
     <w:next w:val="BodyText"/>
     <w:qFormat/>
+    <w:rPr>
+      <w:rFonts w:ascii="Georgia" w:hAnsi="Georgia"/>
+      <w:b w:val="0"/>
+      <w:i w:val="0"/>
+      <w:color w:val="2B2F33"/>
+      <w:sz w:val="20"/>
+    </w:rPr>
   </w:style>
   <w:style w:type="paragraph" w:customStyle="1" w:styleId="Compact">
     <w:name w:val="Compact"/>
@@ -7162,8 +8729,11 @@
       <w:jc w:val="center"/>
     </w:pPr>
     <w:rPr>
-      <w:rFonts w:asciiTheme="majorHAnsi" w:eastAsiaTheme="majorEastAsia" w:hAnsiTheme="majorHAnsi" w:cstheme="majorBidi"/>
-      <w:sz w:val="56"/>
+      <w:rFonts w:asciiTheme="majorHAnsi" w:eastAsiaTheme="majorEastAsia" w:hAnsiTheme="majorHAnsi" w:cstheme="majorBidi" w:ascii="Georgia" w:hAnsi="Georgia"/>
+      <w:b/>
+      <w:i w:val="0"/>
+      <w:color w:val="1F3A5F"/>
+      <w:sz w:val="52"/>
       <w:szCs w:val="56"/>
     </w:rPr>
   </w:style>
@@ -7193,7 +8763,10 @@
       </w:numPr>
     </w:pPr>
     <w:rPr>
-      <w:rFonts w:eastAsiaTheme="majorEastAsia" w:cstheme="majorBidi"/>
+      <w:rFonts w:eastAsiaTheme="majorEastAsia" w:cstheme="majorBidi" w:ascii="Georgia" w:hAnsi="Georgia"/>
+      <w:b w:val="0"/>
+      <w:i w:val="0"/>
+      <w:color w:val="2B2F33"/>
       <w:spacing w:val="15"/>
       <w:sz w:val="28"/>
       <w:szCs w:val="28"/>
@@ -7296,9 +8869,11 @@
       <w:outlineLvl w:val="0"/>
     </w:pPr>
     <w:rPr>
-      <w:rFonts w:asciiTheme="majorHAnsi" w:eastAsiaTheme="majorEastAsia" w:hAnsiTheme="majorHAnsi" w:cstheme="majorBidi"/>
-      <w:color w:val="0F4761" w:themeColor="accent1" w:themeShade="BF"/>
-      <w:sz w:val="40"/>
+      <w:rFonts w:asciiTheme="majorHAnsi" w:eastAsiaTheme="majorEastAsia" w:hAnsiTheme="majorHAnsi" w:cstheme="majorBidi" w:ascii="Avenir Next" w:hAnsi="Avenir Next"/>
+      <w:b/>
+      <w:i w:val="0"/>
+      <w:color w:val="1F3A5F"/>
+      <w:sz w:val="36"/>
       <w:szCs w:val="40"/>
     </w:rPr>
   </w:style>
@@ -7319,9 +8894,11 @@
       <w:outlineLvl w:val="1"/>
     </w:pPr>
     <w:rPr>
-      <w:rFonts w:asciiTheme="majorHAnsi" w:eastAsiaTheme="majorEastAsia" w:hAnsiTheme="majorHAnsi" w:cstheme="majorBidi"/>
-      <w:color w:val="0F4761" w:themeColor="accent1" w:themeShade="BF"/>
-      <w:sz w:val="32"/>
+      <w:rFonts w:asciiTheme="majorHAnsi" w:eastAsiaTheme="majorEastAsia" w:hAnsiTheme="majorHAnsi" w:cstheme="majorBidi" w:ascii="Avenir Next" w:hAnsi="Avenir Next"/>
+      <w:b/>
+      <w:i w:val="0"/>
+      <w:color w:val="1F3A5F"/>
+      <w:sz w:val="29"/>
       <w:szCs w:val="32"/>
     </w:rPr>
   </w:style>
@@ -7342,9 +8919,11 @@
       <w:outlineLvl w:val="2"/>
     </w:pPr>
     <w:rPr>
-      <w:rFonts w:eastAsiaTheme="majorEastAsia" w:cstheme="majorBidi"/>
-      <w:color w:val="0F4761" w:themeColor="accent1" w:themeShade="BF"/>
-      <w:sz w:val="28"/>
+      <w:rFonts w:eastAsiaTheme="majorEastAsia" w:cstheme="majorBidi" w:ascii="Avenir Next" w:hAnsi="Avenir Next"/>
+      <w:b/>
+      <w:i w:val="0"/>
+      <w:color w:val="2B2F33"/>
+      <w:sz w:val="22"/>
       <w:szCs w:val="28"/>
     </w:rPr>
   </w:style>
@@ -7683,7 +9262,11 @@
       <w:spacing w:before="0" w:after="120"/>
     </w:pPr>
     <w:rPr>
-      <w:i/>
+      <w:rFonts w:ascii="Georgia" w:hAnsi="Georgia"/>
+      <w:b w:val="0"/>
+      <w:i w:val="0"/>
+      <w:color w:val="5D6772"/>
+      <w:sz w:val="18"/>
     </w:rPr>
   </w:style>
   <w:style w:type="paragraph" w:customStyle="1" w:styleId="TableCaption">

</xml_diff>